<commit_message>
clase 19sep 10.03 - fin ej tema1
</commit_message>
<xml_diff>
--- a/ACT-1 Consola Web_enunciado - ACM.docx
+++ b/ACT-1 Consola Web_enunciado - ACM.docx
@@ -31,29 +31,38 @@
       </w:pPr>
       <w:r>
         <w:rPr/>
-      </w:r>
-      <w:r>
         <mc:AlternateContent>
           <mc:Choice Requires="wps">
             <w:drawing>
               <wp:inline distT="0" distB="0" distL="0" distR="0">
                 <wp:extent cx="6202680" cy="1493520"/>
                 <wp:effectExtent l="0" t="0" r="0" b="0"/>
-                <wp:docPr id="1" name="Marco1"/>
+                <wp:docPr id="1" name="Forma1"/>
                 <a:graphic xmlns:a="http://schemas.openxmlformats.org/drawingml/2006/main">
                   <a:graphicData uri="http://schemas.microsoft.com/office/word/2010/wordprocessingShape">
                     <wps:wsp>
-                      <wps:cNvSpPr txBox="1"/>
+                      <wps:cNvSpPr/>
                       <wps:spPr>
                         <a:xfrm>
                           <a:off x="0" y="0"/>
-                          <a:ext cx="6202680" cy="1493520"/>
+                          <a:ext cx="6202800" cy="1493640"/>
                         </a:xfrm>
-                        <a:prstGeom prst="rect"/>
+                        <a:prstGeom prst="rect">
+                          <a:avLst/>
+                        </a:prstGeom>
                         <a:solidFill>
-                          <a:srgbClr val="DCDCDC"/>
+                          <a:srgbClr val="dcdcdc"/>
                         </a:solidFill>
+                        <a:ln w="0">
+                          <a:noFill/>
+                        </a:ln>
                       </wps:spPr>
+                      <wps:style>
+                        <a:lnRef idx="0"/>
+                        <a:fillRef idx="0"/>
+                        <a:effectRef idx="0"/>
+                        <a:fontRef idx="minor"/>
+                      </wps:style>
                       <wps:txbx>
                         <w:txbxContent>
                           <w:p>
@@ -355,7 +364,7 @@
                           </w:p>
                         </w:txbxContent>
                       </wps:txbx>
-                      <wps:bodyPr anchor="t" lIns="0" tIns="0" rIns="0" bIns="0">
+                      <wps:bodyPr lIns="0" rIns="0" tIns="0" bIns="0" anchor="t">
                         <a:noAutofit/>
                       </wps:bodyPr>
                     </wps:wsp>
@@ -366,8 +375,10 @@
           </mc:Choice>
           <mc:Fallback>
             <w:pict>
-              <v:rect fillcolor="#DCDCDC" stroked="f" strokeweight="0pt" style="position:absolute;rotation:-0;width:488.4pt;height:117.6pt;mso-wrap-distance-left:9pt;mso-wrap-distance-right:9pt;mso-wrap-distance-top:0pt;mso-wrap-distance-bottom:0pt;margin-top:-117.6pt;mso-position-vertical:top;mso-position-vertical-relative:text;margin-left:0pt;mso-position-horizontal-relative:text">
-                <v:textbox inset="0in,0in,0in,0in">
+              <v:rect id="shape_0" ID="Forma1" path="m0,0l-2147483645,0l-2147483645,-2147483646l0,-2147483646xe" fillcolor="#dcdcdc" stroked="f" o:allowincell="f" style="position:absolute;margin-left:0pt;margin-top:-117.65pt;width:488.35pt;height:117.55pt;mso-wrap-style:square;v-text-anchor:top;mso-position-vertical:top">
+                <v:fill o:detectmouseclick="t" type="solid" color2="#232323"/>
+                <v:stroke color="#3465a4" joinstyle="round" endcap="flat"/>
+                <v:textbox>
                   <w:txbxContent>
                     <w:p>
                       <w:pPr>
@@ -668,7 +679,7 @@
                     </w:p>
                   </w:txbxContent>
                 </v:textbox>
-                <w10:wrap type="none"/>
+                <w10:wrap type="square"/>
               </v:rect>
             </w:pict>
           </mc:Fallback>
@@ -1114,7 +1125,7 @@
           <w:sz w:val="14"/>
         </w:rPr>
         <w:drawing>
-          <wp:anchor behindDoc="0" distT="0" distB="0" distL="0" distR="0" simplePos="0" locked="0" layoutInCell="0" allowOverlap="1" relativeHeight="30">
+          <wp:anchor behindDoc="0" distT="0" distB="0" distL="0" distR="0" simplePos="0" locked="0" layoutInCell="0" allowOverlap="1" relativeHeight="44">
             <wp:simplePos x="0" y="0"/>
             <wp:positionH relativeFrom="page">
               <wp:posOffset>638175</wp:posOffset>
@@ -1125,7 +1136,7 @@
             <wp:extent cx="6170930" cy="292735"/>
             <wp:effectExtent l="0" t="0" r="0" b="0"/>
             <wp:wrapTopAndBottom/>
-            <wp:docPr id="2" name="image1.png" descr=""/>
+            <wp:docPr id="3" name="image1.png" descr=""/>
             <wp:cNvGraphicFramePr>
               <a:graphicFrameLocks xmlns:a="http://schemas.openxmlformats.org/drawingml/2006/main" noChangeAspect="1"/>
             </wp:cNvGraphicFramePr>
@@ -1133,7 +1144,7 @@
               <a:graphicData uri="http://schemas.openxmlformats.org/drawingml/2006/picture">
                 <pic:pic xmlns:pic="http://schemas.openxmlformats.org/drawingml/2006/picture">
                   <pic:nvPicPr>
-                    <pic:cNvPr id="2" name="image1.png" descr=""/>
+                    <pic:cNvPr id="3" name="image1.png" descr=""/>
                     <pic:cNvPicPr>
                       <a:picLocks noChangeAspect="1" noChangeArrowheads="1"/>
                     </pic:cNvPicPr>
@@ -1494,8 +1505,7 @@
       </w:pPr>
       <w:r>
         <w:rPr>
-          <w:sz w:val="26"/>
-          <w:szCs w:val="26"/>
+          <w:b w:val="false"/>
         </w:rPr>
       </w:r>
     </w:p>
@@ -1510,8 +1520,7 @@
       </w:pPr>
       <w:r>
         <w:rPr>
-          <w:sz w:val="26"/>
-          <w:szCs w:val="26"/>
+          <w:b w:val="false"/>
         </w:rPr>
       </w:r>
     </w:p>
@@ -1526,8 +1535,7 @@
       </w:pPr>
       <w:r>
         <w:rPr>
-          <w:sz w:val="26"/>
-          <w:szCs w:val="26"/>
+          <w:b w:val="false"/>
         </w:rPr>
       </w:r>
     </w:p>
@@ -1542,8 +1550,7 @@
       </w:pPr>
       <w:r>
         <w:rPr>
-          <w:sz w:val="26"/>
-          <w:szCs w:val="26"/>
+          <w:b w:val="false"/>
         </w:rPr>
       </w:r>
     </w:p>
@@ -1848,7 +1855,7 @@
       </w:pPr>
       <w:r>
         <w:drawing>
-          <wp:anchor behindDoc="0" distT="0" distB="0" distL="114300" distR="114300" simplePos="0" locked="0" layoutInCell="0" allowOverlap="1" relativeHeight="31">
+          <wp:anchor behindDoc="0" distT="0" distB="0" distL="114300" distR="114300" simplePos="0" locked="0" layoutInCell="0" allowOverlap="1" relativeHeight="45">
             <wp:simplePos x="0" y="0"/>
             <wp:positionH relativeFrom="column">
               <wp:posOffset>1107440</wp:posOffset>
@@ -1859,7 +1866,7 @@
             <wp:extent cx="1878965" cy="2933065"/>
             <wp:effectExtent l="0" t="0" r="0" b="0"/>
             <wp:wrapTopAndBottom/>
-            <wp:docPr id="3" name="Imagen 2" descr=""/>
+            <wp:docPr id="4" name="Imagen 2" descr=""/>
             <wp:cNvGraphicFramePr>
               <a:graphicFrameLocks xmlns:a="http://schemas.openxmlformats.org/drawingml/2006/main" noChangeAspect="1"/>
             </wp:cNvGraphicFramePr>
@@ -1867,7 +1874,7 @@
               <a:graphicData uri="http://schemas.openxmlformats.org/drawingml/2006/picture">
                 <pic:pic xmlns:pic="http://schemas.openxmlformats.org/drawingml/2006/picture">
                   <pic:nvPicPr>
-                    <pic:cNvPr id="3" name="Imagen 2" descr=""/>
+                    <pic:cNvPr id="4" name="Imagen 2" descr=""/>
                     <pic:cNvPicPr>
                       <a:picLocks noChangeAspect="1" noChangeArrowheads="1"/>
                     </pic:cNvPicPr>
@@ -1999,7 +2006,7 @@
           <w:sz w:val="20"/>
         </w:rPr>
         <w:drawing>
-          <wp:anchor behindDoc="0" distT="0" distB="0" distL="0" distR="0" simplePos="0" locked="0" layoutInCell="0" allowOverlap="1" relativeHeight="16">
+          <wp:anchor behindDoc="0" distT="0" distB="0" distL="0" distR="0" simplePos="0" locked="0" layoutInCell="0" allowOverlap="1" relativeHeight="30">
             <wp:simplePos x="0" y="0"/>
             <wp:positionH relativeFrom="page">
               <wp:posOffset>688340</wp:posOffset>
@@ -2010,7 +2017,7 @@
             <wp:extent cx="6198870" cy="1092200"/>
             <wp:effectExtent l="0" t="0" r="0" b="0"/>
             <wp:wrapTopAndBottom/>
-            <wp:docPr id="4" name="image2.jpeg" descr=""/>
+            <wp:docPr id="5" name="image2.jpeg" descr=""/>
             <wp:cNvGraphicFramePr>
               <a:graphicFrameLocks xmlns:a="http://schemas.openxmlformats.org/drawingml/2006/main" noChangeAspect="1"/>
             </wp:cNvGraphicFramePr>
@@ -2018,7 +2025,7 @@
               <a:graphicData uri="http://schemas.openxmlformats.org/drawingml/2006/picture">
                 <pic:pic xmlns:pic="http://schemas.openxmlformats.org/drawingml/2006/picture">
                   <pic:nvPicPr>
-                    <pic:cNvPr id="4" name="image2.jpeg" descr=""/>
+                    <pic:cNvPr id="5" name="image2.jpeg" descr=""/>
                     <pic:cNvPicPr>
                       <a:picLocks noChangeAspect="1" noChangeArrowheads="1"/>
                     </pic:cNvPicPr>
@@ -2074,7 +2081,7 @@
           <wp:inline distT="0" distB="0" distL="0" distR="0">
             <wp:extent cx="2939415" cy="2090420"/>
             <wp:effectExtent l="0" t="0" r="0" b="0"/>
-            <wp:docPr id="5" name="Imagen 5" descr=""/>
+            <wp:docPr id="6" name="Imagen 5" descr=""/>
             <wp:cNvGraphicFramePr>
               <a:graphicFrameLocks xmlns:a="http://schemas.openxmlformats.org/drawingml/2006/main" noChangeAspect="1"/>
             </wp:cNvGraphicFramePr>
@@ -2082,7 +2089,7 @@
               <a:graphicData uri="http://schemas.openxmlformats.org/drawingml/2006/picture">
                 <pic:pic xmlns:pic="http://schemas.openxmlformats.org/drawingml/2006/picture">
                   <pic:nvPicPr>
-                    <pic:cNvPr id="5" name="Imagen 5" descr=""/>
+                    <pic:cNvPr id="6" name="Imagen 5" descr=""/>
                     <pic:cNvPicPr>
                       <a:picLocks noChangeAspect="1" noChangeArrowheads="1"/>
                     </pic:cNvPicPr>
@@ -2486,7 +2493,7 @@
       </w:pPr>
       <w:r>
         <w:drawing>
-          <wp:anchor behindDoc="0" distT="0" distB="0" distL="0" distR="0" simplePos="0" locked="0" layoutInCell="0" allowOverlap="1" relativeHeight="17">
+          <wp:anchor behindDoc="0" distT="0" distB="0" distL="0" distR="0" simplePos="0" locked="0" layoutInCell="0" allowOverlap="1" relativeHeight="31">
             <wp:simplePos x="0" y="0"/>
             <wp:positionH relativeFrom="page">
               <wp:posOffset>2013585</wp:posOffset>
@@ -2497,7 +2504,7 @@
             <wp:extent cx="2581275" cy="476250"/>
             <wp:effectExtent l="0" t="0" r="0" b="0"/>
             <wp:wrapTopAndBottom/>
-            <wp:docPr id="6" name="image3.jpeg" descr=""/>
+            <wp:docPr id="7" name="image3.jpeg" descr=""/>
             <wp:cNvGraphicFramePr>
               <a:graphicFrameLocks xmlns:a="http://schemas.openxmlformats.org/drawingml/2006/main" noChangeAspect="1"/>
             </wp:cNvGraphicFramePr>
@@ -2505,7 +2512,7 @@
               <a:graphicData uri="http://schemas.openxmlformats.org/drawingml/2006/picture">
                 <pic:pic xmlns:pic="http://schemas.openxmlformats.org/drawingml/2006/picture">
                   <pic:nvPicPr>
-                    <pic:cNvPr id="6" name="image3.jpeg" descr=""/>
+                    <pic:cNvPr id="7" name="image3.jpeg" descr=""/>
                     <pic:cNvPicPr>
                       <a:picLocks noChangeAspect="1" noChangeArrowheads="1"/>
                     </pic:cNvPicPr>
@@ -2567,7 +2574,7 @@
           <wp:inline distT="0" distB="0" distL="0" distR="0">
             <wp:extent cx="5286375" cy="2553335"/>
             <wp:effectExtent l="0" t="0" r="0" b="0"/>
-            <wp:docPr id="7" name="Imagen 8" descr=""/>
+            <wp:docPr id="8" name="Imagen 8" descr=""/>
             <wp:cNvGraphicFramePr>
               <a:graphicFrameLocks xmlns:a="http://schemas.openxmlformats.org/drawingml/2006/main" noChangeAspect="1"/>
             </wp:cNvGraphicFramePr>
@@ -2575,7 +2582,7 @@
               <a:graphicData uri="http://schemas.openxmlformats.org/drawingml/2006/picture">
                 <pic:pic xmlns:pic="http://schemas.openxmlformats.org/drawingml/2006/picture">
                   <pic:nvPicPr>
-                    <pic:cNvPr id="7" name="Imagen 8" descr=""/>
+                    <pic:cNvPr id="8" name="Imagen 8" descr=""/>
                     <pic:cNvPicPr>
                       <a:picLocks noChangeAspect="1" noChangeArrowheads="1"/>
                     </pic:cNvPicPr>
@@ -2979,7 +2986,7 @@
           <w:sz w:val="20"/>
         </w:rPr>
         <w:drawing>
-          <wp:anchor behindDoc="0" distT="0" distB="0" distL="0" distR="0" simplePos="0" locked="0" layoutInCell="0" allowOverlap="1" relativeHeight="19">
+          <wp:anchor behindDoc="0" distT="0" distB="0" distL="0" distR="0" simplePos="0" locked="0" layoutInCell="0" allowOverlap="1" relativeHeight="33">
             <wp:simplePos x="0" y="0"/>
             <wp:positionH relativeFrom="page">
               <wp:posOffset>4037330</wp:posOffset>
@@ -2990,7 +2997,7 @@
             <wp:extent cx="2750820" cy="574040"/>
             <wp:effectExtent l="0" t="0" r="0" b="0"/>
             <wp:wrapTopAndBottom/>
-            <wp:docPr id="8" name="image5.jpeg" descr=""/>
+            <wp:docPr id="9" name="image5.jpeg" descr=""/>
             <wp:cNvGraphicFramePr>
               <a:graphicFrameLocks xmlns:a="http://schemas.openxmlformats.org/drawingml/2006/main" noChangeAspect="1"/>
             </wp:cNvGraphicFramePr>
@@ -2998,7 +3005,7 @@
               <a:graphicData uri="http://schemas.openxmlformats.org/drawingml/2006/picture">
                 <pic:pic xmlns:pic="http://schemas.openxmlformats.org/drawingml/2006/picture">
                   <pic:nvPicPr>
-                    <pic:cNvPr id="8" name="image5.jpeg" descr=""/>
+                    <pic:cNvPr id="9" name="image5.jpeg" descr=""/>
                     <pic:cNvPicPr>
                       <a:picLocks noChangeAspect="1" noChangeArrowheads="1"/>
                     </pic:cNvPicPr>
@@ -3044,7 +3051,7 @@
           <w:sz w:val="12"/>
         </w:rPr>
         <w:drawing>
-          <wp:anchor behindDoc="0" distT="0" distB="0" distL="0" distR="0" simplePos="0" locked="0" layoutInCell="0" allowOverlap="1" relativeHeight="18">
+          <wp:anchor behindDoc="0" distT="0" distB="0" distL="0" distR="0" simplePos="0" locked="0" layoutInCell="0" allowOverlap="1" relativeHeight="32">
             <wp:simplePos x="0" y="0"/>
             <wp:positionH relativeFrom="page">
               <wp:posOffset>1021080</wp:posOffset>
@@ -3055,7 +3062,7 @@
             <wp:extent cx="1816735" cy="284480"/>
             <wp:effectExtent l="0" t="0" r="0" b="0"/>
             <wp:wrapTopAndBottom/>
-            <wp:docPr id="9" name="image4.jpeg" descr=""/>
+            <wp:docPr id="10" name="image4.jpeg" descr=""/>
             <wp:cNvGraphicFramePr>
               <a:graphicFrameLocks xmlns:a="http://schemas.openxmlformats.org/drawingml/2006/main" noChangeAspect="1"/>
             </wp:cNvGraphicFramePr>
@@ -3063,7 +3070,7 @@
               <a:graphicData uri="http://schemas.openxmlformats.org/drawingml/2006/picture">
                 <pic:pic xmlns:pic="http://schemas.openxmlformats.org/drawingml/2006/picture">
                   <pic:nvPicPr>
-                    <pic:cNvPr id="9" name="image4.jpeg" descr=""/>
+                    <pic:cNvPr id="10" name="image4.jpeg" descr=""/>
                     <pic:cNvPicPr>
                       <a:picLocks noChangeAspect="1" noChangeArrowheads="1"/>
                     </pic:cNvPicPr>
@@ -3108,7 +3115,7 @@
           <wp:inline distT="0" distB="0" distL="0" distR="0">
             <wp:extent cx="4636770" cy="2588895"/>
             <wp:effectExtent l="0" t="0" r="0" b="0"/>
-            <wp:docPr id="10" name="Imagen 14" descr=""/>
+            <wp:docPr id="11" name="Imagen 14" descr=""/>
             <wp:cNvGraphicFramePr>
               <a:graphicFrameLocks xmlns:a="http://schemas.openxmlformats.org/drawingml/2006/main" noChangeAspect="1"/>
             </wp:cNvGraphicFramePr>
@@ -3116,7 +3123,7 @@
               <a:graphicData uri="http://schemas.openxmlformats.org/drawingml/2006/picture">
                 <pic:pic xmlns:pic="http://schemas.openxmlformats.org/drawingml/2006/picture">
                   <pic:nvPicPr>
-                    <pic:cNvPr id="10" name="Imagen 14" descr=""/>
+                    <pic:cNvPr id="11" name="Imagen 14" descr=""/>
                     <pic:cNvPicPr>
                       <a:picLocks noChangeAspect="1" noChangeArrowheads="1"/>
                     </pic:cNvPicPr>
@@ -3386,7 +3393,7 @@
           <w:sz w:val="14"/>
         </w:rPr>
         <w:drawing>
-          <wp:anchor behindDoc="0" distT="0" distB="0" distL="0" distR="0" simplePos="0" locked="0" layoutInCell="0" allowOverlap="1" relativeHeight="20">
+          <wp:anchor behindDoc="0" distT="0" distB="0" distL="0" distR="0" simplePos="0" locked="0" layoutInCell="0" allowOverlap="1" relativeHeight="34">
             <wp:simplePos x="0" y="0"/>
             <wp:positionH relativeFrom="page">
               <wp:posOffset>933450</wp:posOffset>
@@ -3397,7 +3404,7 @@
             <wp:extent cx="4101465" cy="1068705"/>
             <wp:effectExtent l="0" t="0" r="0" b="0"/>
             <wp:wrapTopAndBottom/>
-            <wp:docPr id="11" name="image6.jpeg" descr=""/>
+            <wp:docPr id="12" name="image6.jpeg" descr=""/>
             <wp:cNvGraphicFramePr>
               <a:graphicFrameLocks xmlns:a="http://schemas.openxmlformats.org/drawingml/2006/main" noChangeAspect="1"/>
             </wp:cNvGraphicFramePr>
@@ -3405,7 +3412,7 @@
               <a:graphicData uri="http://schemas.openxmlformats.org/drawingml/2006/picture">
                 <pic:pic xmlns:pic="http://schemas.openxmlformats.org/drawingml/2006/picture">
                   <pic:nvPicPr>
-                    <pic:cNvPr id="11" name="image6.jpeg" descr=""/>
+                    <pic:cNvPr id="12" name="image6.jpeg" descr=""/>
                     <pic:cNvPicPr>
                       <a:picLocks noChangeAspect="1" noChangeArrowheads="1"/>
                     </pic:cNvPicPr>
@@ -3454,7 +3461,7 @@
       <w:r>
         <w:rPr/>
         <w:drawing>
-          <wp:anchor behindDoc="0" distT="0" distB="0" distL="0" distR="0" simplePos="0" locked="0" layoutInCell="0" allowOverlap="1" relativeHeight="21">
+          <wp:anchor behindDoc="0" distT="0" distB="0" distL="0" distR="0" simplePos="0" locked="0" layoutInCell="0" allowOverlap="1" relativeHeight="35">
             <wp:simplePos x="0" y="0"/>
             <wp:positionH relativeFrom="page">
               <wp:posOffset>2215515</wp:posOffset>
@@ -3465,7 +3472,7 @@
             <wp:extent cx="2103120" cy="878205"/>
             <wp:effectExtent l="0" t="0" r="0" b="0"/>
             <wp:wrapTopAndBottom/>
-            <wp:docPr id="12" name="image7.jpeg" descr=""/>
+            <wp:docPr id="13" name="image7.jpeg" descr=""/>
             <wp:cNvGraphicFramePr>
               <a:graphicFrameLocks xmlns:a="http://schemas.openxmlformats.org/drawingml/2006/main" noChangeAspect="1"/>
             </wp:cNvGraphicFramePr>
@@ -3473,7 +3480,7 @@
               <a:graphicData uri="http://schemas.openxmlformats.org/drawingml/2006/picture">
                 <pic:pic xmlns:pic="http://schemas.openxmlformats.org/drawingml/2006/picture">
                   <pic:nvPicPr>
-                    <pic:cNvPr id="12" name="image7.jpeg" descr=""/>
+                    <pic:cNvPr id="13" name="image7.jpeg" descr=""/>
                     <pic:cNvPicPr>
                       <a:picLocks noChangeAspect="1" noChangeArrowheads="1"/>
                     </pic:cNvPicPr>
@@ -3604,7 +3611,7 @@
           <w:sz w:val="17"/>
         </w:rPr>
         <w:drawing>
-          <wp:anchor behindDoc="0" distT="0" distB="0" distL="0" distR="0" simplePos="0" locked="0" layoutInCell="0" allowOverlap="1" relativeHeight="22">
+          <wp:anchor behindDoc="0" distT="0" distB="0" distL="0" distR="0" simplePos="0" locked="0" layoutInCell="0" allowOverlap="1" relativeHeight="36">
             <wp:simplePos x="0" y="0"/>
             <wp:positionH relativeFrom="page">
               <wp:posOffset>685800</wp:posOffset>
@@ -3615,7 +3622,7 @@
             <wp:extent cx="6106795" cy="903605"/>
             <wp:effectExtent l="0" t="0" r="0" b="0"/>
             <wp:wrapTopAndBottom/>
-            <wp:docPr id="13" name="image8.jpeg" descr=""/>
+            <wp:docPr id="14" name="image8.jpeg" descr=""/>
             <wp:cNvGraphicFramePr>
               <a:graphicFrameLocks xmlns:a="http://schemas.openxmlformats.org/drawingml/2006/main" noChangeAspect="1"/>
             </wp:cNvGraphicFramePr>
@@ -3623,7 +3630,7 @@
               <a:graphicData uri="http://schemas.openxmlformats.org/drawingml/2006/picture">
                 <pic:pic xmlns:pic="http://schemas.openxmlformats.org/drawingml/2006/picture">
                   <pic:nvPicPr>
-                    <pic:cNvPr id="13" name="image8.jpeg" descr=""/>
+                    <pic:cNvPr id="14" name="image8.jpeg" descr=""/>
                     <pic:cNvPicPr>
                       <a:picLocks noChangeAspect="1" noChangeArrowheads="1"/>
                     </pic:cNvPicPr>
@@ -3738,9 +3745,11 @@
         </w:rPr>
       </w:pPr>
       <w:r>
-        <w:rPr/>
+        <w:rPr>
+          <w:sz w:val="17"/>
+        </w:rPr>
         <w:drawing>
-          <wp:anchor behindDoc="0" distT="0" distB="0" distL="0" distR="0" simplePos="0" locked="0" layoutInCell="0" allowOverlap="1" relativeHeight="32">
+          <wp:anchor behindDoc="0" distT="0" distB="0" distL="0" distR="0" simplePos="0" locked="0" layoutInCell="0" allowOverlap="1" relativeHeight="46">
             <wp:simplePos x="0" y="0"/>
             <wp:positionH relativeFrom="column">
               <wp:align>center</wp:align>
@@ -3751,7 +3760,7 @@
             <wp:extent cx="6436360" cy="3884930"/>
             <wp:effectExtent l="0" t="0" r="0" b="0"/>
             <wp:wrapSquare wrapText="largest"/>
-            <wp:docPr id="14" name="Imagen1" descr=""/>
+            <wp:docPr id="15" name="Imagen1" descr=""/>
             <wp:cNvGraphicFramePr>
               <a:graphicFrameLocks xmlns:a="http://schemas.openxmlformats.org/drawingml/2006/main" noChangeAspect="1"/>
             </wp:cNvGraphicFramePr>
@@ -3759,7 +3768,7 @@
               <a:graphicData uri="http://schemas.openxmlformats.org/drawingml/2006/picture">
                 <pic:pic xmlns:pic="http://schemas.openxmlformats.org/drawingml/2006/picture">
                   <pic:nvPicPr>
-                    <pic:cNvPr id="14" name="Imagen1" descr=""/>
+                    <pic:cNvPr id="15" name="Imagen1" descr=""/>
                     <pic:cNvPicPr>
                       <a:picLocks noChangeAspect="1" noChangeArrowheads="1"/>
                     </pic:cNvPicPr>
@@ -3889,7 +3898,7 @@
           <w:sz w:val="17"/>
         </w:rPr>
         <w:drawing>
-          <wp:anchor behindDoc="0" distT="0" distB="0" distL="0" distR="0" simplePos="0" locked="0" layoutInCell="0" allowOverlap="1" relativeHeight="23">
+          <wp:anchor behindDoc="0" distT="0" distB="0" distL="0" distR="0" simplePos="0" locked="0" layoutInCell="0" allowOverlap="1" relativeHeight="37">
             <wp:simplePos x="0" y="0"/>
             <wp:positionH relativeFrom="page">
               <wp:posOffset>1141730</wp:posOffset>
@@ -3900,7 +3909,7 @@
             <wp:extent cx="5283835" cy="2473960"/>
             <wp:effectExtent l="0" t="0" r="0" b="0"/>
             <wp:wrapTopAndBottom/>
-            <wp:docPr id="16" name="image9.jpeg" descr=""/>
+            <wp:docPr id="18" name="image9.jpeg" descr=""/>
             <wp:cNvGraphicFramePr>
               <a:graphicFrameLocks xmlns:a="http://schemas.openxmlformats.org/drawingml/2006/main" noChangeAspect="1"/>
             </wp:cNvGraphicFramePr>
@@ -3908,7 +3917,7 @@
               <a:graphicData uri="http://schemas.openxmlformats.org/drawingml/2006/picture">
                 <pic:pic xmlns:pic="http://schemas.openxmlformats.org/drawingml/2006/picture">
                   <pic:nvPicPr>
-                    <pic:cNvPr id="16" name="image9.jpeg" descr=""/>
+                    <pic:cNvPr id="18" name="image9.jpeg" descr=""/>
                     <pic:cNvPicPr>
                       <a:picLocks noChangeAspect="1" noChangeArrowheads="1"/>
                     </pic:cNvPicPr>
@@ -3957,7 +3966,7 @@
       </w:pPr>
       <w:r>
         <w:drawing>
-          <wp:anchor behindDoc="0" distT="0" distB="0" distL="0" distR="0" simplePos="0" locked="0" layoutInCell="0" allowOverlap="1" relativeHeight="33">
+          <wp:anchor behindDoc="0" distT="0" distB="0" distL="0" distR="0" simplePos="0" locked="0" layoutInCell="0" allowOverlap="1" relativeHeight="47">
             <wp:simplePos x="0" y="0"/>
             <wp:positionH relativeFrom="column">
               <wp:align>center</wp:align>
@@ -3968,7 +3977,7 @@
             <wp:extent cx="5553710" cy="3492500"/>
             <wp:effectExtent l="0" t="0" r="0" b="0"/>
             <wp:wrapSquare wrapText="largest"/>
-            <wp:docPr id="17" name="Imagen4" descr=""/>
+            <wp:docPr id="19" name="Imagen4" descr=""/>
             <wp:cNvGraphicFramePr>
               <a:graphicFrameLocks xmlns:a="http://schemas.openxmlformats.org/drawingml/2006/main" noChangeAspect="1"/>
             </wp:cNvGraphicFramePr>
@@ -3976,7 +3985,7 @@
               <a:graphicData uri="http://schemas.openxmlformats.org/drawingml/2006/picture">
                 <pic:pic xmlns:pic="http://schemas.openxmlformats.org/drawingml/2006/picture">
                   <pic:nvPicPr>
-                    <pic:cNvPr id="17" name="Imagen4" descr=""/>
+                    <pic:cNvPr id="19" name="Imagen4" descr=""/>
                     <pic:cNvPicPr>
                       <a:picLocks noChangeAspect="1" noChangeArrowheads="1"/>
                     </pic:cNvPicPr>
@@ -4466,7 +4475,7 @@
           <w:sz w:val="16"/>
         </w:rPr>
         <w:drawing>
-          <wp:anchor behindDoc="0" distT="0" distB="0" distL="0" distR="0" simplePos="0" locked="0" layoutInCell="0" allowOverlap="1" relativeHeight="24">
+          <wp:anchor behindDoc="0" distT="0" distB="0" distL="0" distR="0" simplePos="0" locked="0" layoutInCell="0" allowOverlap="1" relativeHeight="38">
             <wp:simplePos x="0" y="0"/>
             <wp:positionH relativeFrom="page">
               <wp:posOffset>2006600</wp:posOffset>
@@ -4477,7 +4486,7 @@
             <wp:extent cx="3770630" cy="1193800"/>
             <wp:effectExtent l="0" t="0" r="0" b="0"/>
             <wp:wrapTopAndBottom/>
-            <wp:docPr id="18" name="image10.jpeg" descr=""/>
+            <wp:docPr id="20" name="image10.jpeg" descr=""/>
             <wp:cNvGraphicFramePr>
               <a:graphicFrameLocks xmlns:a="http://schemas.openxmlformats.org/drawingml/2006/main" noChangeAspect="1"/>
             </wp:cNvGraphicFramePr>
@@ -4485,7 +4494,7 @@
               <a:graphicData uri="http://schemas.openxmlformats.org/drawingml/2006/picture">
                 <pic:pic xmlns:pic="http://schemas.openxmlformats.org/drawingml/2006/picture">
                   <pic:nvPicPr>
-                    <pic:cNvPr id="18" name="image10.jpeg" descr=""/>
+                    <pic:cNvPr id="20" name="image10.jpeg" descr=""/>
                     <pic:cNvPicPr>
                       <a:picLocks noChangeAspect="1" noChangeArrowheads="1"/>
                     </pic:cNvPicPr>
@@ -4535,7 +4544,7 @@
       </w:pPr>
       <w:r>
         <w:drawing>
-          <wp:anchor behindDoc="0" distT="0" distB="0" distL="0" distR="0" simplePos="0" locked="0" layoutInCell="0" allowOverlap="1" relativeHeight="34">
+          <wp:anchor behindDoc="0" distT="0" distB="0" distL="0" distR="0" simplePos="0" locked="0" layoutInCell="0" allowOverlap="1" relativeHeight="48">
             <wp:simplePos x="0" y="0"/>
             <wp:positionH relativeFrom="column">
               <wp:align>center</wp:align>
@@ -4546,7 +4555,7 @@
             <wp:extent cx="6874510" cy="2332990"/>
             <wp:effectExtent l="0" t="0" r="0" b="0"/>
             <wp:wrapSquare wrapText="largest"/>
-            <wp:docPr id="19" name="Imagen3" descr=""/>
+            <wp:docPr id="21" name="Imagen3" descr=""/>
             <wp:cNvGraphicFramePr>
               <a:graphicFrameLocks xmlns:a="http://schemas.openxmlformats.org/drawingml/2006/main" noChangeAspect="1"/>
             </wp:cNvGraphicFramePr>
@@ -4554,7 +4563,7 @@
               <a:graphicData uri="http://schemas.openxmlformats.org/drawingml/2006/picture">
                 <pic:pic xmlns:pic="http://schemas.openxmlformats.org/drawingml/2006/picture">
                   <pic:nvPicPr>
-                    <pic:cNvPr id="19" name="Imagen3" descr=""/>
+                    <pic:cNvPr id="21" name="Imagen3" descr=""/>
                     <pic:cNvPicPr>
                       <a:picLocks noChangeAspect="1" noChangeArrowheads="1"/>
                     </pic:cNvPicPr>
@@ -4887,7 +4896,7 @@
           <wp:inline distT="0" distB="0" distL="0" distR="0">
             <wp:extent cx="2424430" cy="1510030"/>
             <wp:effectExtent l="0" t="0" r="0" b="0"/>
-            <wp:docPr id="20" name="image11.jpeg" descr=""/>
+            <wp:docPr id="22" name="image11.jpeg" descr=""/>
             <wp:cNvGraphicFramePr>
               <a:graphicFrameLocks xmlns:a="http://schemas.openxmlformats.org/drawingml/2006/main" noChangeAspect="1"/>
             </wp:cNvGraphicFramePr>
@@ -4895,7 +4904,7 @@
               <a:graphicData uri="http://schemas.openxmlformats.org/drawingml/2006/picture">
                 <pic:pic xmlns:pic="http://schemas.openxmlformats.org/drawingml/2006/picture">
                   <pic:nvPicPr>
-                    <pic:cNvPr id="20" name="image11.jpeg" descr=""/>
+                    <pic:cNvPr id="22" name="image11.jpeg" descr=""/>
                     <pic:cNvPicPr>
                       <a:picLocks noChangeAspect="1" noChangeArrowheads="1"/>
                     </pic:cNvPicPr>
@@ -4933,7 +4942,10 @@
         </w:rPr>
       </w:pPr>
       <w:r>
-        <w:rPr/>
+        <w:rPr>
+          <w:b w:val="false"/>
+          <w:sz w:val="20"/>
+        </w:rPr>
       </w:r>
     </w:p>
     <w:p>
@@ -4953,16 +4965,7 @@
           <w:sz w:val="26"/>
           <w:szCs w:val="26"/>
         </w:rPr>
-        <w:t xml:space="preserve">El $_ </w:t>
-      </w:r>
-      <w:r>
-        <w:rPr>
-          <w:b w:val="false"/>
-          <w:bCs w:val="false"/>
-          <w:sz w:val="26"/>
-          <w:szCs w:val="26"/>
-        </w:rPr>
-        <w:t xml:space="preserve">almacena la </w:t>
+        <w:t xml:space="preserve">El $_ almacena la </w:t>
       </w:r>
       <w:r>
         <w:rPr>
@@ -5046,7 +5049,7 @@
       </w:r>
       <w:r>
         <w:drawing>
-          <wp:anchor behindDoc="0" distT="0" distB="0" distL="0" distR="0" simplePos="0" locked="0" layoutInCell="0" allowOverlap="1" relativeHeight="35">
+          <wp:anchor behindDoc="0" distT="0" distB="0" distL="0" distR="0" simplePos="0" locked="0" layoutInCell="0" allowOverlap="1" relativeHeight="49">
             <wp:simplePos x="0" y="0"/>
             <wp:positionH relativeFrom="column">
               <wp:align>center</wp:align>
@@ -5057,7 +5060,7 @@
             <wp:extent cx="5553710" cy="2208530"/>
             <wp:effectExtent l="0" t="0" r="0" b="0"/>
             <wp:wrapSquare wrapText="largest"/>
-            <wp:docPr id="21" name="Imagen6" descr=""/>
+            <wp:docPr id="23" name="Imagen6" descr=""/>
             <wp:cNvGraphicFramePr>
               <a:graphicFrameLocks xmlns:a="http://schemas.openxmlformats.org/drawingml/2006/main" noChangeAspect="1"/>
             </wp:cNvGraphicFramePr>
@@ -5065,7 +5068,7 @@
               <a:graphicData uri="http://schemas.openxmlformats.org/drawingml/2006/picture">
                 <pic:pic xmlns:pic="http://schemas.openxmlformats.org/drawingml/2006/picture">
                   <pic:nvPicPr>
-                    <pic:cNvPr id="21" name="Imagen6" descr=""/>
+                    <pic:cNvPr id="23" name="Imagen6" descr=""/>
                     <pic:cNvPicPr>
                       <a:picLocks noChangeAspect="1" noChangeArrowheads="1"/>
                     </pic:cNvPicPr>
@@ -5118,25 +5121,14 @@
         </w:rPr>
       </w:pPr>
       <w:r>
-        <w:rPr/>
-      </w:r>
-    </w:p>
-    <w:p>
-      <w:pPr>
-        <w:pStyle w:val="Cuerpodetexto"/>
-        <w:ind w:hanging="0"/>
-        <w:rPr>
-          <w:rFonts w:ascii="Times New Roman" w:hAnsi="Times New Roman" w:eastAsia="Times New Roman" w:cs="Times New Roman"/>
-          <w:b/>
+        <w:rPr>
+          <w:rFonts w:eastAsia="Times New Roman" w:cs="Times New Roman"/>
           <w:b/>
           <w:bCs/>
           <w:sz w:val="30"/>
           <w:szCs w:val="30"/>
           <w:lang w:val="es-ES"/>
         </w:rPr>
-      </w:pPr>
-      <w:r>
-        <w:rPr/>
       </w:r>
     </w:p>
     <w:p>
@@ -5154,25 +5146,14 @@
         </w:rPr>
       </w:pPr>
       <w:r>
-        <w:rPr/>
-      </w:r>
-    </w:p>
-    <w:p>
-      <w:pPr>
-        <w:pStyle w:val="Cuerpodetexto"/>
-        <w:ind w:hanging="0"/>
-        <w:rPr>
-          <w:rFonts w:ascii="Times New Roman" w:hAnsi="Times New Roman" w:eastAsia="Times New Roman" w:cs="Times New Roman"/>
-          <w:b/>
+        <w:rPr>
+          <w:rFonts w:eastAsia="Times New Roman" w:cs="Times New Roman"/>
           <w:b/>
           <w:bCs/>
           <w:sz w:val="30"/>
           <w:szCs w:val="30"/>
           <w:lang w:val="es-ES"/>
         </w:rPr>
-      </w:pPr>
-      <w:r>
-        <w:rPr/>
       </w:r>
     </w:p>
     <w:p>
@@ -5190,25 +5171,14 @@
         </w:rPr>
       </w:pPr>
       <w:r>
-        <w:rPr/>
-      </w:r>
-    </w:p>
-    <w:p>
-      <w:pPr>
-        <w:pStyle w:val="Cuerpodetexto"/>
-        <w:ind w:hanging="0"/>
-        <w:rPr>
-          <w:rFonts w:ascii="Times New Roman" w:hAnsi="Times New Roman" w:eastAsia="Times New Roman" w:cs="Times New Roman"/>
-          <w:b/>
+        <w:rPr>
+          <w:rFonts w:eastAsia="Times New Roman" w:cs="Times New Roman"/>
           <w:b/>
           <w:bCs/>
           <w:sz w:val="30"/>
           <w:szCs w:val="30"/>
           <w:lang w:val="es-ES"/>
         </w:rPr>
-      </w:pPr>
-      <w:r>
-        <w:rPr/>
       </w:r>
     </w:p>
     <w:p>
@@ -5226,25 +5196,14 @@
         </w:rPr>
       </w:pPr>
       <w:r>
-        <w:rPr/>
-      </w:r>
-    </w:p>
-    <w:p>
-      <w:pPr>
-        <w:pStyle w:val="Cuerpodetexto"/>
-        <w:ind w:hanging="0"/>
-        <w:rPr>
-          <w:rFonts w:ascii="Times New Roman" w:hAnsi="Times New Roman" w:eastAsia="Times New Roman" w:cs="Times New Roman"/>
-          <w:b/>
+        <w:rPr>
+          <w:rFonts w:eastAsia="Times New Roman" w:cs="Times New Roman"/>
           <w:b/>
           <w:bCs/>
           <w:sz w:val="30"/>
           <w:szCs w:val="30"/>
           <w:lang w:val="es-ES"/>
         </w:rPr>
-      </w:pPr>
-      <w:r>
-        <w:rPr/>
       </w:r>
     </w:p>
     <w:p>
@@ -5262,27 +5221,141 @@
         </w:rPr>
       </w:pPr>
       <w:r>
-        <w:rPr/>
-      </w:r>
-    </w:p>
-    <w:p>
-      <w:pPr>
-        <w:pStyle w:val="Cuerpodetexto"/>
-        <w:ind w:hanging="0"/>
-        <w:rPr>
-          <w:rFonts w:ascii="Times New Roman" w:hAnsi="Times New Roman" w:eastAsia="Times New Roman" w:cs="Times New Roman"/>
-          <w:b/>
+        <w:rPr>
+          <w:rFonts w:eastAsia="Times New Roman" w:cs="Times New Roman"/>
           <w:b/>
           <w:bCs/>
           <w:sz w:val="30"/>
           <w:szCs w:val="30"/>
           <w:lang w:val="es-ES"/>
         </w:rPr>
-      </w:pPr>
-      <w:r>
-        <w:rPr/>
+      </w:r>
+    </w:p>
+    <w:p>
+      <w:pPr>
+        <w:pStyle w:val="Cuerpodetexto"/>
+        <w:ind w:hanging="0"/>
+        <w:rPr>
+          <w:rFonts w:ascii="Times New Roman" w:hAnsi="Times New Roman" w:eastAsia="Times New Roman" w:cs="Times New Roman"/>
+          <w:b/>
+          <w:b/>
+          <w:bCs/>
+          <w:sz w:val="30"/>
+          <w:szCs w:val="30"/>
+          <w:lang w:val="es-ES"/>
+        </w:rPr>
+      </w:pPr>
+      <w:r>
+        <w:rPr>
+          <w:rFonts w:eastAsia="Times New Roman" w:cs="Times New Roman"/>
+          <w:b/>
+          <w:bCs/>
+          <w:sz w:val="30"/>
+          <w:szCs w:val="30"/>
+          <w:lang w:val="es-ES"/>
+        </w:rPr>
+      </w:r>
+    </w:p>
+    <w:p>
+      <w:pPr>
+        <w:pStyle w:val="Cuerpodetexto"/>
+        <w:ind w:hanging="0"/>
+        <w:rPr>
+          <w:rFonts w:ascii="Times New Roman" w:hAnsi="Times New Roman" w:eastAsia="Times New Roman" w:cs="Times New Roman"/>
+          <w:b/>
+          <w:b/>
+          <w:bCs/>
+          <w:sz w:val="30"/>
+          <w:szCs w:val="30"/>
+          <w:lang w:val="es-ES"/>
+        </w:rPr>
+      </w:pPr>
+      <w:r>
+        <w:rPr>
+          <w:rFonts w:eastAsia="Times New Roman" w:cs="Times New Roman"/>
+          <w:b/>
+          <w:bCs/>
+          <w:sz w:val="30"/>
+          <w:szCs w:val="30"/>
+          <w:lang w:val="es-ES"/>
+        </w:rPr>
+      </w:r>
+    </w:p>
+    <w:p>
+      <w:pPr>
+        <w:pStyle w:val="Cuerpodetexto"/>
+        <w:ind w:hanging="0"/>
+        <w:rPr>
+          <w:rFonts w:ascii="Times New Roman" w:hAnsi="Times New Roman" w:eastAsia="Times New Roman" w:cs="Times New Roman"/>
+          <w:b/>
+          <w:b/>
+          <w:bCs/>
+          <w:sz w:val="30"/>
+          <w:szCs w:val="30"/>
+          <w:lang w:val="es-ES"/>
+        </w:rPr>
+      </w:pPr>
+      <w:r>
+        <w:rPr>
+          <w:rFonts w:eastAsia="Times New Roman" w:cs="Times New Roman"/>
+          <w:b/>
+          <w:bCs/>
+          <w:sz w:val="30"/>
+          <w:szCs w:val="30"/>
+          <w:lang w:val="es-ES"/>
+        </w:rPr>
+      </w:r>
+    </w:p>
+    <w:p>
+      <w:pPr>
+        <w:pStyle w:val="Cuerpodetexto"/>
+        <w:ind w:hanging="0"/>
+        <w:rPr>
+          <w:rFonts w:ascii="Times New Roman" w:hAnsi="Times New Roman" w:eastAsia="Times New Roman" w:cs="Times New Roman"/>
+          <w:b/>
+          <w:b/>
+          <w:bCs/>
+          <w:sz w:val="30"/>
+          <w:szCs w:val="30"/>
+          <w:lang w:val="es-ES"/>
+        </w:rPr>
+      </w:pPr>
+      <w:r>
+        <w:rPr>
+          <w:rFonts w:eastAsia="Times New Roman" w:cs="Times New Roman"/>
+          <w:b/>
+          <w:bCs/>
+          <w:sz w:val="30"/>
+          <w:szCs w:val="30"/>
+          <w:lang w:val="es-ES"/>
+        </w:rPr>
+      </w:r>
+    </w:p>
+    <w:p>
+      <w:pPr>
+        <w:pStyle w:val="Cuerpodetexto"/>
+        <w:ind w:hanging="0"/>
+        <w:rPr>
+          <w:rFonts w:ascii="Times New Roman" w:hAnsi="Times New Roman" w:eastAsia="Times New Roman" w:cs="Times New Roman"/>
+          <w:b/>
+          <w:b/>
+          <w:bCs/>
+          <w:sz w:val="30"/>
+          <w:szCs w:val="30"/>
+          <w:lang w:val="es-ES"/>
+        </w:rPr>
+      </w:pPr>
+      <w:r>
+        <w:rPr>
+          <w:rFonts w:eastAsia="Times New Roman" w:cs="Times New Roman"/>
+          <w:b/>
+          <w:bCs/>
+          <w:sz w:val="30"/>
+          <w:szCs w:val="30"/>
+          <w:lang w:val="es-ES"/>
+        </w:rPr>
         <w:drawing>
-          <wp:anchor behindDoc="0" distT="0" distB="0" distL="0" distR="0" simplePos="0" locked="0" layoutInCell="0" allowOverlap="1" relativeHeight="36">
+          <wp:anchor behindDoc="0" distT="0" distB="0" distL="0" distR="0" simplePos="0" locked="0" layoutInCell="0" allowOverlap="1" relativeHeight="50">
             <wp:simplePos x="0" y="0"/>
             <wp:positionH relativeFrom="column">
               <wp:posOffset>2407920</wp:posOffset>
@@ -5293,7 +5366,7 @@
             <wp:extent cx="2059305" cy="1118870"/>
             <wp:effectExtent l="0" t="0" r="0" b="0"/>
             <wp:wrapSquare wrapText="largest"/>
-            <wp:docPr id="22" name="Imagen7" descr=""/>
+            <wp:docPr id="24" name="Imagen7" descr=""/>
             <wp:cNvGraphicFramePr>
               <a:graphicFrameLocks xmlns:a="http://schemas.openxmlformats.org/drawingml/2006/main" noChangeAspect="1"/>
             </wp:cNvGraphicFramePr>
@@ -5301,7 +5374,7 @@
               <a:graphicData uri="http://schemas.openxmlformats.org/drawingml/2006/picture">
                 <pic:pic xmlns:pic="http://schemas.openxmlformats.org/drawingml/2006/picture">
                   <pic:nvPicPr>
-                    <pic:cNvPr id="22" name="Imagen7" descr=""/>
+                    <pic:cNvPr id="24" name="Imagen7" descr=""/>
                     <pic:cNvPicPr>
                       <a:picLocks noChangeAspect="1" noChangeArrowheads="1"/>
                     </pic:cNvPicPr>
@@ -5486,11 +5559,8 @@
         </w:rPr>
       </w:pPr>
       <w:r>
-        <w:rPr>
-          <w:sz w:val="19"/>
-        </w:rPr>
         <w:drawing>
-          <wp:anchor behindDoc="0" distT="0" distB="0" distL="0" distR="0" simplePos="0" locked="0" layoutInCell="0" allowOverlap="1" relativeHeight="25">
+          <wp:anchor behindDoc="0" distT="0" distB="0" distL="0" distR="0" simplePos="0" locked="0" layoutInCell="0" allowOverlap="1" relativeHeight="39">
             <wp:simplePos x="0" y="0"/>
             <wp:positionH relativeFrom="page">
               <wp:posOffset>308610</wp:posOffset>
@@ -5501,7 +5571,7 @@
             <wp:extent cx="3933825" cy="2257425"/>
             <wp:effectExtent l="0" t="0" r="0" b="0"/>
             <wp:wrapTopAndBottom/>
-            <wp:docPr id="24" name="image12.jpeg" descr=""/>
+            <wp:docPr id="27" name="image12.jpeg" descr=""/>
             <wp:cNvGraphicFramePr>
               <a:graphicFrameLocks xmlns:a="http://schemas.openxmlformats.org/drawingml/2006/main" noChangeAspect="1"/>
             </wp:cNvGraphicFramePr>
@@ -5509,7 +5579,7 @@
               <a:graphicData uri="http://schemas.openxmlformats.org/drawingml/2006/picture">
                 <pic:pic xmlns:pic="http://schemas.openxmlformats.org/drawingml/2006/picture">
                   <pic:nvPicPr>
-                    <pic:cNvPr id="24" name="image12.jpeg" descr=""/>
+                    <pic:cNvPr id="27" name="image12.jpeg" descr=""/>
                     <pic:cNvPicPr>
                       <a:picLocks noChangeAspect="1" noChangeArrowheads="1"/>
                     </pic:cNvPicPr>
@@ -5535,7 +5605,7 @@
           </wp:anchor>
         </w:drawing>
         <w:drawing>
-          <wp:anchor behindDoc="0" distT="0" distB="0" distL="0" distR="0" simplePos="0" locked="0" layoutInCell="0" allowOverlap="1" relativeHeight="26">
+          <wp:anchor behindDoc="0" distT="0" distB="0" distL="0" distR="0" simplePos="0" locked="0" layoutInCell="0" allowOverlap="1" relativeHeight="40">
             <wp:simplePos x="0" y="0"/>
             <wp:positionH relativeFrom="page">
               <wp:posOffset>4646930</wp:posOffset>
@@ -5546,7 +5616,7 @@
             <wp:extent cx="2400300" cy="1485900"/>
             <wp:effectExtent l="0" t="0" r="0" b="0"/>
             <wp:wrapTopAndBottom/>
-            <wp:docPr id="25" name="image13.jpeg" descr=""/>
+            <wp:docPr id="28" name="image13.jpeg" descr=""/>
             <wp:cNvGraphicFramePr>
               <a:graphicFrameLocks xmlns:a="http://schemas.openxmlformats.org/drawingml/2006/main" noChangeAspect="1"/>
             </wp:cNvGraphicFramePr>
@@ -5554,7 +5624,7 @@
               <a:graphicData uri="http://schemas.openxmlformats.org/drawingml/2006/picture">
                 <pic:pic xmlns:pic="http://schemas.openxmlformats.org/drawingml/2006/picture">
                   <pic:nvPicPr>
-                    <pic:cNvPr id="25" name="image13.jpeg" descr=""/>
+                    <pic:cNvPr id="28" name="image13.jpeg" descr=""/>
                     <pic:cNvPicPr>
                       <a:picLocks noChangeAspect="1" noChangeArrowheads="1"/>
                     </pic:cNvPicPr>
@@ -5580,6 +5650,192 @@
           </wp:anchor>
         </w:drawing>
       </w:r>
+      <w:r>
+        <w:rPr>
+          <w:sz w:val="19"/>
+        </w:rPr>
+        <w:t xml:space="preserve"> </w:t>
+      </w:r>
+    </w:p>
+    <w:p>
+      <w:pPr>
+        <w:pStyle w:val="Cuerpodetexto"/>
+        <w:spacing w:before="1" w:after="0"/>
+        <w:rPr>
+          <w:sz w:val="19"/>
+        </w:rPr>
+      </w:pPr>
+      <w:r>
+        <w:rPr>
+          <w:sz w:val="19"/>
+        </w:rPr>
+      </w:r>
+    </w:p>
+    <w:p>
+      <w:pPr>
+        <w:pStyle w:val="Cuerpodetexto"/>
+        <w:spacing w:before="1" w:after="0"/>
+        <w:rPr>
+          <w:sz w:val="19"/>
+        </w:rPr>
+      </w:pPr>
+      <w:r>
+        <w:rPr>
+          <w:sz w:val="19"/>
+        </w:rPr>
+        <w:tab/>
+      </w:r>
+      <w:r>
+        <w:rPr>
+          <w:b w:val="false"/>
+          <w:bCs w:val="false"/>
+          <w:sz w:val="26"/>
+          <w:szCs w:val="26"/>
+        </w:rPr>
+        <w:t>Se crean grupos de consola para agrupar c</w:t>
+      </w:r>
+      <w:r>
+        <w:rPr>
+          <w:rFonts w:eastAsia="Times New Roman" w:cs="Times New Roman"/>
+          <w:b w:val="false"/>
+          <w:bCs w:val="false"/>
+          <w:color w:val="auto"/>
+          <w:kern w:val="0"/>
+          <w:sz w:val="26"/>
+          <w:szCs w:val="26"/>
+          <w:lang w:val="es-ES" w:eastAsia="en-US" w:bidi="ar-SA"/>
+        </w:rPr>
+        <w:t>ódigo.</w:t>
+      </w:r>
+      <w:r>
+        <w:rPr>
+          <w:b w:val="false"/>
+          <w:bCs w:val="false"/>
+          <w:sz w:val="26"/>
+          <w:szCs w:val="26"/>
+        </w:rPr>
+        <w:br/>
+        <w:tab/>
+        <w:t xml:space="preserve">Con el console group y un cierre se agrupa todo el mensaje y con .groupCollapsed se crea otro </w:t>
+        <w:tab/>
+        <w:t>grupo que no se muestra, en este caso est</w:t>
+      </w:r>
+      <w:r>
+        <w:rPr>
+          <w:rFonts w:eastAsia="Times New Roman" w:cs="Times New Roman"/>
+          <w:b w:val="false"/>
+          <w:bCs w:val="false"/>
+          <w:color w:val="auto"/>
+          <w:kern w:val="0"/>
+          <w:sz w:val="26"/>
+          <w:szCs w:val="26"/>
+          <w:lang w:val="es-ES" w:eastAsia="en-US" w:bidi="ar-SA"/>
+        </w:rPr>
+        <w:t xml:space="preserve">á dentro del primer grupo, por lo tanto sería un </w:t>
+        <w:tab/>
+        <w:t>subgrupo.</w:t>
+      </w:r>
+    </w:p>
+    <w:p>
+      <w:pPr>
+        <w:pStyle w:val="Cuerpodetexto"/>
+        <w:spacing w:before="1" w:after="0"/>
+        <w:rPr>
+          <w:sz w:val="19"/>
+        </w:rPr>
+      </w:pPr>
+      <w:r>
+        <w:rPr>
+          <w:rFonts w:eastAsia="Times New Roman" w:cs="Times New Roman"/>
+          <w:b w:val="false"/>
+          <w:bCs w:val="false"/>
+          <w:color w:val="auto"/>
+          <w:kern w:val="0"/>
+          <w:sz w:val="26"/>
+          <w:szCs w:val="26"/>
+          <w:lang w:val="es-ES" w:eastAsia="en-US" w:bidi="ar-SA"/>
+        </w:rPr>
+        <w:tab/>
+      </w:r>
+    </w:p>
+    <w:p>
+      <w:pPr>
+        <w:pStyle w:val="Cuerpodetexto"/>
+        <w:spacing w:before="1" w:after="0"/>
+        <w:rPr>
+          <w:sz w:val="19"/>
+        </w:rPr>
+      </w:pPr>
+      <w:r>
+        <w:rPr>
+          <w:rFonts w:eastAsia="Times New Roman" w:cs="Times New Roman"/>
+          <w:b w:val="false"/>
+          <w:bCs w:val="false"/>
+          <w:color w:val="auto"/>
+          <w:kern w:val="0"/>
+          <w:sz w:val="26"/>
+          <w:szCs w:val="26"/>
+          <w:lang w:val="es-ES" w:eastAsia="en-US" w:bidi="ar-SA"/>
+        </w:rPr>
+        <w:drawing>
+          <wp:anchor behindDoc="0" distT="0" distB="0" distL="0" distR="0" simplePos="0" locked="0" layoutInCell="0" allowOverlap="1" relativeHeight="53">
+            <wp:simplePos x="0" y="0"/>
+            <wp:positionH relativeFrom="column">
+              <wp:align>center</wp:align>
+            </wp:positionH>
+            <wp:positionV relativeFrom="paragraph">
+              <wp:posOffset>635</wp:posOffset>
+            </wp:positionV>
+            <wp:extent cx="6874510" cy="2738755"/>
+            <wp:effectExtent l="0" t="0" r="0" b="0"/>
+            <wp:wrapTopAndBottom/>
+            <wp:docPr id="29" name="Imagen11" descr=""/>
+            <wp:cNvGraphicFramePr>
+              <a:graphicFrameLocks xmlns:a="http://schemas.openxmlformats.org/drawingml/2006/main" noChangeAspect="1"/>
+            </wp:cNvGraphicFramePr>
+            <a:graphic xmlns:a="http://schemas.openxmlformats.org/drawingml/2006/main">
+              <a:graphicData uri="http://schemas.openxmlformats.org/drawingml/2006/picture">
+                <pic:pic xmlns:pic="http://schemas.openxmlformats.org/drawingml/2006/picture">
+                  <pic:nvPicPr>
+                    <pic:cNvPr id="29" name="Imagen11" descr=""/>
+                    <pic:cNvPicPr>
+                      <a:picLocks noChangeAspect="1" noChangeArrowheads="1"/>
+                    </pic:cNvPicPr>
+                  </pic:nvPicPr>
+                  <pic:blipFill>
+                    <a:blip r:embed="rId28"/>
+                    <a:stretch>
+                      <a:fillRect/>
+                    </a:stretch>
+                  </pic:blipFill>
+                  <pic:spPr bwMode="auto">
+                    <a:xfrm>
+                      <a:off x="0" y="0"/>
+                      <a:ext cx="6874510" cy="2738755"/>
+                    </a:xfrm>
+                    <a:prstGeom prst="rect">
+                      <a:avLst/>
+                    </a:prstGeom>
+                  </pic:spPr>
+                </pic:pic>
+              </a:graphicData>
+            </a:graphic>
+          </wp:anchor>
+        </w:drawing>
+      </w:r>
+      <w:r>
+        <w:rPr>
+          <w:rFonts w:eastAsia="Times New Roman" w:cs="Times New Roman"/>
+          <w:b w:val="false"/>
+          <w:bCs w:val="false"/>
+          <w:color w:val="auto"/>
+          <w:kern w:val="0"/>
+          <w:sz w:val="26"/>
+          <w:szCs w:val="26"/>
+          <w:lang w:val="es-ES" w:eastAsia="en-US" w:bidi="ar-SA"/>
+        </w:rPr>
+        <w:tab/>
+      </w:r>
     </w:p>
     <w:p>
       <w:pPr>
@@ -5709,7 +5965,7 @@
           <w:sz w:val="24"/>
         </w:rPr>
         <w:drawing>
-          <wp:anchor behindDoc="0" distT="0" distB="0" distL="0" distR="0" simplePos="0" locked="0" layoutInCell="0" allowOverlap="1" relativeHeight="27">
+          <wp:anchor behindDoc="0" distT="0" distB="0" distL="0" distR="0" simplePos="0" locked="0" layoutInCell="0" allowOverlap="1" relativeHeight="41">
             <wp:simplePos x="0" y="0"/>
             <wp:positionH relativeFrom="page">
               <wp:posOffset>762000</wp:posOffset>
@@ -5720,7 +5976,7 @@
             <wp:extent cx="6189980" cy="1448435"/>
             <wp:effectExtent l="0" t="0" r="0" b="0"/>
             <wp:wrapTopAndBottom/>
-            <wp:docPr id="26" name="image14.jpeg" descr=""/>
+            <wp:docPr id="30" name="image14.jpeg" descr=""/>
             <wp:cNvGraphicFramePr>
               <a:graphicFrameLocks xmlns:a="http://schemas.openxmlformats.org/drawingml/2006/main" noChangeAspect="1"/>
             </wp:cNvGraphicFramePr>
@@ -5728,13 +5984,13 @@
               <a:graphicData uri="http://schemas.openxmlformats.org/drawingml/2006/picture">
                 <pic:pic xmlns:pic="http://schemas.openxmlformats.org/drawingml/2006/picture">
                   <pic:nvPicPr>
-                    <pic:cNvPr id="26" name="image14.jpeg" descr=""/>
+                    <pic:cNvPr id="30" name="image14.jpeg" descr=""/>
                     <pic:cNvPicPr>
                       <a:picLocks noChangeAspect="1" noChangeArrowheads="1"/>
                     </pic:cNvPicPr>
                   </pic:nvPicPr>
                   <pic:blipFill>
-                    <a:blip r:embed="rId28"/>
+                    <a:blip r:embed="rId29"/>
                     <a:stretch>
                       <a:fillRect/>
                     </a:stretch>
@@ -5945,6 +6201,70 @@
     </w:p>
     <w:p>
       <w:pPr>
+        <w:pStyle w:val="Normal"/>
+        <w:spacing w:before="281" w:after="0"/>
+        <w:ind w:left="1729" w:right="1411" w:hanging="0"/>
+        <w:jc w:val="center"/>
+        <w:rPr>
+          <w:rFonts w:ascii="Trebuchet MS" w:hAnsi="Trebuchet MS"/>
+          <w:b/>
+          <w:b/>
+          <w:i/>
+          <w:i/>
+          <w:sz w:val="27"/>
+        </w:rPr>
+      </w:pPr>
+      <w:r>
+        <w:rPr/>
+        <w:drawing>
+          <wp:anchor behindDoc="0" distT="0" distB="0" distL="0" distR="0" simplePos="0" locked="0" layoutInCell="0" allowOverlap="1" relativeHeight="51">
+            <wp:simplePos x="0" y="0"/>
+            <wp:positionH relativeFrom="column">
+              <wp:posOffset>1488440</wp:posOffset>
+            </wp:positionH>
+            <wp:positionV relativeFrom="paragraph">
+              <wp:posOffset>193040</wp:posOffset>
+            </wp:positionV>
+            <wp:extent cx="3741420" cy="2279015"/>
+            <wp:effectExtent l="0" t="0" r="0" b="0"/>
+            <wp:wrapTopAndBottom/>
+            <wp:docPr id="31" name="Imagen9" descr=""/>
+            <wp:cNvGraphicFramePr>
+              <a:graphicFrameLocks xmlns:a="http://schemas.openxmlformats.org/drawingml/2006/main" noChangeAspect="1"/>
+            </wp:cNvGraphicFramePr>
+            <a:graphic xmlns:a="http://schemas.openxmlformats.org/drawingml/2006/main">
+              <a:graphicData uri="http://schemas.openxmlformats.org/drawingml/2006/picture">
+                <pic:pic xmlns:pic="http://schemas.openxmlformats.org/drawingml/2006/picture">
+                  <pic:nvPicPr>
+                    <pic:cNvPr id="31" name="Imagen9" descr=""/>
+                    <pic:cNvPicPr>
+                      <a:picLocks noChangeAspect="1" noChangeArrowheads="1"/>
+                    </pic:cNvPicPr>
+                  </pic:nvPicPr>
+                  <pic:blipFill>
+                    <a:blip r:embed="rId30"/>
+                    <a:stretch>
+                      <a:fillRect/>
+                    </a:stretch>
+                  </pic:blipFill>
+                  <pic:spPr bwMode="auto">
+                    <a:xfrm>
+                      <a:off x="0" y="0"/>
+                      <a:ext cx="3741420" cy="2279015"/>
+                    </a:xfrm>
+                    <a:prstGeom prst="rect">
+                      <a:avLst/>
+                    </a:prstGeom>
+                  </pic:spPr>
+                </pic:pic>
+              </a:graphicData>
+            </a:graphic>
+          </wp:anchor>
+        </w:drawing>
+      </w:r>
+    </w:p>
+    <w:p>
+      <w:pPr>
         <w:pStyle w:val="Cuerpodetexto"/>
         <w:rPr>
           <w:rFonts w:ascii="Trebuchet MS" w:hAnsi="Trebuchet MS"/>
@@ -5957,6 +6277,68 @@
           <w:rFonts w:ascii="Trebuchet MS" w:hAnsi="Trebuchet MS"/>
           <w:i/>
         </w:rPr>
+        <w:t xml:space="preserve">   </w:t>
+      </w:r>
+      <w:r>
+        <w:rPr>
+          <w:rFonts w:ascii="Trebuchet MS" w:hAnsi="Trebuchet MS"/>
+          <w:i/>
+        </w:rPr>
+        <w:tab/>
+      </w:r>
+    </w:p>
+    <w:p>
+      <w:pPr>
+        <w:pStyle w:val="Cuerpodetexto"/>
+        <w:rPr>
+          <w:rFonts w:ascii="Trebuchet MS" w:hAnsi="Trebuchet MS"/>
+          <w:i/>
+          <w:i/>
+        </w:rPr>
+      </w:pPr>
+      <w:r>
+        <w:rPr>
+          <w:rFonts w:ascii="Trebuchet MS" w:hAnsi="Trebuchet MS"/>
+          <w:i/>
+        </w:rPr>
+      </w:r>
+    </w:p>
+    <w:p>
+      <w:pPr>
+        <w:pStyle w:val="Cuerpodetexto"/>
+        <w:rPr>
+          <w:rFonts w:ascii="Trebuchet MS" w:hAnsi="Trebuchet MS"/>
+          <w:i/>
+          <w:i/>
+        </w:rPr>
+      </w:pPr>
+      <w:r>
+        <w:rPr>
+          <w:rFonts w:ascii="Trebuchet MS" w:hAnsi="Trebuchet MS"/>
+          <w:i/>
+        </w:rPr>
+        <w:tab/>
+      </w:r>
+      <w:r>
+        <w:rPr>
+          <w:rFonts w:eastAsia="Times New Roman" w:cs="Times New Roman"/>
+          <w:b w:val="false"/>
+          <w:bCs w:val="false"/>
+          <w:i w:val="false"/>
+          <w:iCs w:val="false"/>
+          <w:color w:val="auto"/>
+          <w:kern w:val="0"/>
+          <w:sz w:val="26"/>
+          <w:szCs w:val="26"/>
+          <w:lang w:val="es-ES" w:eastAsia="en-US" w:bidi="ar-SA"/>
+        </w:rPr>
+        <w:t xml:space="preserve">Activa en modo edición para hacer modificaciones en la página en directo, </w:t>
+        <w:tab/>
+        <w:t xml:space="preserve">pero igualmente sin </w:t>
+        <w:tab/>
+        <w:t xml:space="preserve">modificar el archivo. Es útil para ver las posibles modificaciones o corrección antes de </w:t>
+        <w:tab/>
+        <w:t xml:space="preserve">implementarlas. </w:t>
       </w:r>
     </w:p>
     <w:p>
@@ -6107,7 +6489,7 @@
       </w:pPr>
       <w:r>
         <w:drawing>
-          <wp:anchor behindDoc="0" distT="0" distB="0" distL="0" distR="0" simplePos="0" locked="0" layoutInCell="0" allowOverlap="1" relativeHeight="29">
+          <wp:anchor behindDoc="0" distT="0" distB="0" distL="0" distR="0" simplePos="0" locked="0" layoutInCell="0" allowOverlap="1" relativeHeight="43">
             <wp:simplePos x="0" y="0"/>
             <wp:positionH relativeFrom="page">
               <wp:posOffset>685800</wp:posOffset>
@@ -6118,7 +6500,7 @@
             <wp:extent cx="6188710" cy="1621155"/>
             <wp:effectExtent l="0" t="0" r="0" b="0"/>
             <wp:wrapNone/>
-            <wp:docPr id="27" name="image15.png" descr=""/>
+            <wp:docPr id="32" name="image15.png" descr=""/>
             <wp:cNvGraphicFramePr>
               <a:graphicFrameLocks xmlns:a="http://schemas.openxmlformats.org/drawingml/2006/main" noChangeAspect="1"/>
             </wp:cNvGraphicFramePr>
@@ -6126,13 +6508,13 @@
               <a:graphicData uri="http://schemas.openxmlformats.org/drawingml/2006/picture">
                 <pic:pic xmlns:pic="http://schemas.openxmlformats.org/drawingml/2006/picture">
                   <pic:nvPicPr>
-                    <pic:cNvPr id="27" name="image15.png" descr=""/>
+                    <pic:cNvPr id="32" name="image15.png" descr=""/>
                     <pic:cNvPicPr>
                       <a:picLocks noChangeAspect="1" noChangeArrowheads="1"/>
                     </pic:cNvPicPr>
                   </pic:nvPicPr>
                   <pic:blipFill>
-                    <a:blip r:embed="rId29"/>
+                    <a:blip r:embed="rId31"/>
                     <a:stretch>
                       <a:fillRect/>
                     </a:stretch>
@@ -6174,32 +6556,17 @@
     </w:p>
     <w:p>
       <w:pPr>
-        <w:sectPr>
-          <w:headerReference w:type="default" r:id="rId30"/>
-          <w:type w:val="nextPage"/>
-          <w:pgSz w:w="11906" w:h="16838"/>
-          <w:pgMar w:left="380" w:right="700" w:gutter="0" w:header="703" w:top="1340" w:footer="0" w:bottom="280"/>
-          <w:pgNumType w:fmt="decimal"/>
-          <w:formProt w:val="false"/>
-          <w:textDirection w:val="lrTb"/>
-          <w:docGrid w:type="default" w:linePitch="100" w:charSpace="4096"/>
-        </w:sectPr>
         <w:pStyle w:val="Cuerpodetexto"/>
         <w:spacing w:before="6" w:after="0"/>
         <w:rPr>
           <w:sz w:val="24"/>
         </w:rPr>
       </w:pPr>
-      <w:r>
-        <w:rPr>
-          <w:sz w:val="24"/>
-        </w:rPr>
-      </w:r>
       <w:r>
         <mc:AlternateContent>
           <mc:Choice Requires="wps">
             <w:drawing>
-              <wp:anchor behindDoc="1" distT="0" distB="0" distL="0" distR="0" simplePos="0" locked="0" layoutInCell="0" allowOverlap="1" relativeHeight="6">
+              <wp:anchor behindDoc="1" distT="0" distB="0" distL="0" distR="0" simplePos="0" locked="0" layoutInCell="0" allowOverlap="1" relativeHeight="22">
                 <wp:simplePos x="0" y="0"/>
                 <wp:positionH relativeFrom="page">
                   <wp:posOffset>685800</wp:posOffset>
@@ -6210,23 +6577,30 @@
                 <wp:extent cx="6188710" cy="1621155"/>
                 <wp:effectExtent l="0" t="0" r="0" b="0"/>
                 <wp:wrapTopAndBottom/>
-                <wp:docPr id="29" name="Marco3"/>
+                <wp:docPr id="33" name="Marco3"/>
                 <a:graphic xmlns:a="http://schemas.openxmlformats.org/drawingml/2006/main">
                   <a:graphicData uri="http://schemas.microsoft.com/office/word/2010/wordprocessingShape">
                     <wps:wsp>
-                      <wps:cNvSpPr txBox="1"/>
+                      <wps:cNvSpPr/>
                       <wps:spPr>
                         <a:xfrm>
                           <a:off x="0" y="0"/>
-                          <a:ext cx="6188710" cy="1621155"/>
+                          <a:ext cx="6188760" cy="1621080"/>
                         </a:xfrm>
-                        <a:prstGeom prst="rect"/>
-                        <a:solidFill>
-                          <a:srgbClr val="FFFFFF">
-                            <a:alpha val="0"/>
-                          </a:srgbClr>
-                        </a:solidFill>
+                        <a:prstGeom prst="rect">
+                          <a:avLst/>
+                        </a:prstGeom>
+                        <a:noFill/>
+                        <a:ln w="0">
+                          <a:noFill/>
+                        </a:ln>
                       </wps:spPr>
+                      <wps:style>
+                        <a:lnRef idx="0"/>
+                        <a:fillRef idx="0"/>
+                        <a:effectRef idx="0"/>
+                        <a:fontRef idx="minor"/>
+                      </wps:style>
                       <wps:txbx>
                         <w:txbxContent>
                           <w:p>
@@ -6358,7 +6732,7 @@
                           </w:p>
                         </w:txbxContent>
                       </wps:txbx>
-                      <wps:bodyPr anchor="t" lIns="0" tIns="0" rIns="0" bIns="0">
+                      <wps:bodyPr lIns="0" rIns="0" tIns="0" bIns="0" anchor="t">
                         <a:noAutofit/>
                       </wps:bodyPr>
                     </wps:wsp>
@@ -6369,8 +6743,10 @@
           </mc:Choice>
           <mc:Fallback>
             <w:pict>
-              <v:rect stroked="f" strokeweight="0pt" style="position:absolute;rotation:-0;width:487.3pt;height:127.65pt;mso-wrap-distance-left:0pt;mso-wrap-distance-right:0pt;mso-wrap-distance-top:0pt;mso-wrap-distance-bottom:0pt;margin-top:16.05pt;mso-position-vertical-relative:text;margin-left:54pt;mso-position-horizontal-relative:page">
-                <v:textbox inset="0in,0in,0in,0in">
+              <v:rect id="shape_0" ID="Marco3" path="m0,0l-2147483645,0l-2147483645,-2147483646l0,-2147483646xe" fillcolor="white" stroked="f" o:allowincell="f" style="position:absolute;margin-left:54pt;margin-top:16.05pt;width:487.25pt;height:127.6pt;mso-wrap-style:square;v-text-anchor:top;mso-position-horizontal-relative:page">
+                <v:fill o:detectmouseclick="t" type="solid" color2="black" opacity="0"/>
+                <v:stroke color="#3465a4" joinstyle="round" endcap="flat"/>
+                <v:textbox>
                   <w:txbxContent>
                     <w:p>
                       <w:pPr>
@@ -6507,6 +6883,202 @@
           </mc:Fallback>
         </mc:AlternateContent>
       </w:r>
+      <w:r>
+        <w:rPr>
+          <w:sz w:val="24"/>
+        </w:rPr>
+        <w:t xml:space="preserve"> </w:t>
+      </w:r>
+    </w:p>
+    <w:p>
+      <w:pPr>
+        <w:pStyle w:val="Cuerpodetexto"/>
+        <w:spacing w:before="6" w:after="0"/>
+        <w:rPr>
+          <w:sz w:val="24"/>
+        </w:rPr>
+      </w:pPr>
+      <w:r>
+        <w:rPr>
+          <w:sz w:val="24"/>
+        </w:rPr>
+      </w:r>
+    </w:p>
+    <w:p>
+      <w:pPr>
+        <w:pStyle w:val="Cuerpodetexto"/>
+        <w:spacing w:before="6" w:after="0"/>
+        <w:rPr>
+          <w:sz w:val="24"/>
+        </w:rPr>
+      </w:pPr>
+      <w:r>
+        <w:rPr>
+          <w:sz w:val="24"/>
+        </w:rPr>
+      </w:r>
+    </w:p>
+    <w:p>
+      <w:pPr>
+        <w:pStyle w:val="Cuerpodetexto"/>
+        <w:spacing w:before="6" w:after="0"/>
+        <w:rPr>
+          <w:sz w:val="24"/>
+        </w:rPr>
+      </w:pPr>
+      <w:r>
+        <w:rPr>
+          <w:sz w:val="24"/>
+        </w:rPr>
+        <w:tab/>
+      </w:r>
+      <w:r>
+        <w:rPr>
+          <w:b w:val="false"/>
+          <w:bCs w:val="false"/>
+          <w:sz w:val="24"/>
+        </w:rPr>
+        <w:t>Solo funciona en Chrome, pero captura la ventana de la web no la parte de consola web ni c</w:t>
+      </w:r>
+      <w:r>
+        <w:rPr>
+          <w:rFonts w:eastAsia="Times New Roman" w:cs="Times New Roman"/>
+          <w:b w:val="false"/>
+          <w:bCs w:val="false"/>
+          <w:color w:val="auto"/>
+          <w:kern w:val="0"/>
+          <w:sz w:val="24"/>
+          <w:szCs w:val="30"/>
+          <w:lang w:val="es-ES" w:eastAsia="en-US" w:bidi="ar-SA"/>
+        </w:rPr>
+        <w:t>ódigo.</w:t>
+      </w:r>
+    </w:p>
+    <w:p>
+      <w:pPr>
+        <w:pStyle w:val="Cuerpodetexto"/>
+        <w:spacing w:before="6" w:after="0"/>
+        <w:rPr>
+          <w:sz w:val="24"/>
+        </w:rPr>
+      </w:pPr>
+      <w:r>
+        <w:rPr>
+          <w:sz w:val="24"/>
+        </w:rPr>
+      </w:r>
+    </w:p>
+    <w:p>
+      <w:pPr>
+        <w:pStyle w:val="Cuerpodetexto"/>
+        <w:spacing w:before="6" w:after="0"/>
+        <w:rPr>
+          <w:sz w:val="24"/>
+        </w:rPr>
+      </w:pPr>
+      <w:r>
+        <w:rPr>
+          <w:rFonts w:eastAsia="Times New Roman" w:cs="Times New Roman"/>
+          <w:b w:val="false"/>
+          <w:bCs w:val="false"/>
+          <w:color w:val="auto"/>
+          <w:kern w:val="0"/>
+          <w:sz w:val="24"/>
+          <w:szCs w:val="30"/>
+          <w:lang w:val="es-ES" w:eastAsia="en-US" w:bidi="ar-SA"/>
+        </w:rPr>
+        <w:drawing>
+          <wp:anchor behindDoc="0" distT="0" distB="0" distL="0" distR="0" simplePos="0" locked="0" layoutInCell="0" allowOverlap="1" relativeHeight="52">
+            <wp:simplePos x="0" y="0"/>
+            <wp:positionH relativeFrom="column">
+              <wp:posOffset>658495</wp:posOffset>
+            </wp:positionH>
+            <wp:positionV relativeFrom="paragraph">
+              <wp:posOffset>20320</wp:posOffset>
+            </wp:positionV>
+            <wp:extent cx="5539105" cy="2377440"/>
+            <wp:effectExtent l="0" t="0" r="0" b="0"/>
+            <wp:wrapTopAndBottom/>
+            <wp:docPr id="35" name="Imagen10" descr=""/>
+            <wp:cNvGraphicFramePr>
+              <a:graphicFrameLocks xmlns:a="http://schemas.openxmlformats.org/drawingml/2006/main" noChangeAspect="1"/>
+            </wp:cNvGraphicFramePr>
+            <a:graphic xmlns:a="http://schemas.openxmlformats.org/drawingml/2006/main">
+              <a:graphicData uri="http://schemas.openxmlformats.org/drawingml/2006/picture">
+                <pic:pic xmlns:pic="http://schemas.openxmlformats.org/drawingml/2006/picture">
+                  <pic:nvPicPr>
+                    <pic:cNvPr id="35" name="Imagen10" descr=""/>
+                    <pic:cNvPicPr>
+                      <a:picLocks noChangeAspect="1" noChangeArrowheads="1"/>
+                    </pic:cNvPicPr>
+                  </pic:nvPicPr>
+                  <pic:blipFill>
+                    <a:blip r:embed="rId32"/>
+                    <a:stretch>
+                      <a:fillRect/>
+                    </a:stretch>
+                  </pic:blipFill>
+                  <pic:spPr bwMode="auto">
+                    <a:xfrm>
+                      <a:off x="0" y="0"/>
+                      <a:ext cx="5539105" cy="2377440"/>
+                    </a:xfrm>
+                    <a:prstGeom prst="rect">
+                      <a:avLst/>
+                    </a:prstGeom>
+                  </pic:spPr>
+                </pic:pic>
+              </a:graphicData>
+            </a:graphic>
+          </wp:anchor>
+        </w:drawing>
+      </w:r>
+      <w:r>
+        <w:rPr>
+          <w:rFonts w:eastAsia="Times New Roman" w:cs="Times New Roman"/>
+          <w:b w:val="false"/>
+          <w:bCs w:val="false"/>
+          <w:color w:val="auto"/>
+          <w:kern w:val="0"/>
+          <w:sz w:val="24"/>
+          <w:szCs w:val="30"/>
+          <w:lang w:val="es-ES" w:eastAsia="en-US" w:bidi="ar-SA"/>
+        </w:rPr>
+        <w:tab/>
+        <w:t xml:space="preserve">  </w:t>
+      </w:r>
+    </w:p>
+    <w:p>
+      <w:pPr>
+        <w:sectPr>
+          <w:headerReference w:type="default" r:id="rId33"/>
+          <w:type w:val="nextPage"/>
+          <w:pgSz w:w="11906" w:h="16838"/>
+          <w:pgMar w:left="380" w:right="700" w:gutter="0" w:header="703" w:top="1340" w:footer="0" w:bottom="280"/>
+          <w:pgNumType w:fmt="decimal"/>
+          <w:formProt w:val="false"/>
+          <w:textDirection w:val="lrTb"/>
+          <w:docGrid w:type="default" w:linePitch="100" w:charSpace="4096"/>
+        </w:sectPr>
+        <w:pStyle w:val="Cuerpodetexto"/>
+        <w:spacing w:before="6" w:after="0"/>
+        <w:rPr>
+          <w:sz w:val="24"/>
+        </w:rPr>
+      </w:pPr>
+      <w:r>
+        <w:rPr>
+          <w:rFonts w:eastAsia="Times New Roman" w:cs="Times New Roman"/>
+          <w:b w:val="false"/>
+          <w:bCs w:val="false"/>
+          <w:color w:val="auto"/>
+          <w:kern w:val="0"/>
+          <w:sz w:val="24"/>
+          <w:szCs w:val="30"/>
+          <w:lang w:val="es-ES" w:eastAsia="en-US" w:bidi="ar-SA"/>
+        </w:rPr>
+        <w:t xml:space="preserve"> </w:t>
+      </w:r>
     </w:p>
     <w:p>
       <w:pPr>
@@ -6845,6 +7417,7 @@
         <w:rPr>
           <w:sz w:val="32"/>
         </w:rPr>
+        <w:tab/>
       </w:r>
     </w:p>
     <w:p>
@@ -6856,8 +7429,311 @@
       </w:pPr>
       <w:r>
         <w:rPr>
+          <w:b w:val="false"/>
+          <w:bCs w:val="false"/>
+          <w:sz w:val="26"/>
+          <w:szCs w:val="26"/>
+        </w:rPr>
+        <w:tab/>
+        <w:t xml:space="preserve">- </w:t>
+      </w:r>
+      <w:r>
+        <w:rPr>
+          <w:b w:val="false"/>
+          <w:bCs w:val="false"/>
+          <w:sz w:val="26"/>
+          <w:szCs w:val="26"/>
+        </w:rPr>
+        <w:t>Prueba 1: en etiqueta &lt;script&gt; dentro del c</w:t>
+      </w:r>
+      <w:r>
+        <w:rPr>
+          <w:rFonts w:eastAsia="Times New Roman" w:cs="Times New Roman"/>
+          <w:b w:val="false"/>
+          <w:bCs w:val="false"/>
+          <w:color w:val="auto"/>
+          <w:kern w:val="0"/>
+          <w:sz w:val="26"/>
+          <w:szCs w:val="26"/>
+          <w:lang w:val="es-ES" w:eastAsia="en-US" w:bidi="ar-SA"/>
+        </w:rPr>
+        <w:t>ódigo html.</w:t>
+      </w:r>
+    </w:p>
+    <w:p>
+      <w:pPr>
+        <w:pStyle w:val="Cuerpodetexto"/>
+        <w:rPr>
           <w:sz w:val="32"/>
         </w:rPr>
+      </w:pPr>
+      <w:r>
+        <w:drawing>
+          <wp:anchor behindDoc="0" distT="0" distB="0" distL="0" distR="0" simplePos="0" locked="0" layoutInCell="0" allowOverlap="1" relativeHeight="54">
+            <wp:simplePos x="0" y="0"/>
+            <wp:positionH relativeFrom="column">
+              <wp:align>center</wp:align>
+            </wp:positionH>
+            <wp:positionV relativeFrom="paragraph">
+              <wp:posOffset>635</wp:posOffset>
+            </wp:positionV>
+            <wp:extent cx="6874510" cy="2041525"/>
+            <wp:effectExtent l="0" t="0" r="0" b="0"/>
+            <wp:wrapTopAndBottom/>
+            <wp:docPr id="38" name="Imagen12" descr=""/>
+            <wp:cNvGraphicFramePr>
+              <a:graphicFrameLocks xmlns:a="http://schemas.openxmlformats.org/drawingml/2006/main" noChangeAspect="1"/>
+            </wp:cNvGraphicFramePr>
+            <a:graphic xmlns:a="http://schemas.openxmlformats.org/drawingml/2006/main">
+              <a:graphicData uri="http://schemas.openxmlformats.org/drawingml/2006/picture">
+                <pic:pic xmlns:pic="http://schemas.openxmlformats.org/drawingml/2006/picture">
+                  <pic:nvPicPr>
+                    <pic:cNvPr id="38" name="Imagen12" descr=""/>
+                    <pic:cNvPicPr>
+                      <a:picLocks noChangeAspect="1" noChangeArrowheads="1"/>
+                    </pic:cNvPicPr>
+                  </pic:nvPicPr>
+                  <pic:blipFill>
+                    <a:blip r:embed="rId34"/>
+                    <a:stretch>
+                      <a:fillRect/>
+                    </a:stretch>
+                  </pic:blipFill>
+                  <pic:spPr bwMode="auto">
+                    <a:xfrm>
+                      <a:off x="0" y="0"/>
+                      <a:ext cx="6874510" cy="2041525"/>
+                    </a:xfrm>
+                    <a:prstGeom prst="rect">
+                      <a:avLst/>
+                    </a:prstGeom>
+                  </pic:spPr>
+                </pic:pic>
+              </a:graphicData>
+            </a:graphic>
+          </wp:anchor>
+        </w:drawing>
+      </w:r>
+      <w:r>
+        <w:rPr>
+          <w:rFonts w:eastAsia="Times New Roman" w:cs="Times New Roman"/>
+          <w:b w:val="false"/>
+          <w:bCs w:val="false"/>
+          <w:color w:val="auto"/>
+          <w:kern w:val="0"/>
+          <w:sz w:val="26"/>
+          <w:szCs w:val="26"/>
+          <w:lang w:val="es-ES" w:eastAsia="en-US" w:bidi="ar-SA"/>
+        </w:rPr>
+        <w:tab/>
+      </w:r>
+    </w:p>
+    <w:p>
+      <w:pPr>
+        <w:pStyle w:val="Cuerpodetexto"/>
+        <w:rPr>
+          <w:sz w:val="32"/>
+        </w:rPr>
+      </w:pPr>
+      <w:r>
+        <w:rPr>
+          <w:rFonts w:eastAsia="Times New Roman" w:cs="Times New Roman"/>
+          <w:b w:val="false"/>
+          <w:bCs w:val="false"/>
+          <w:color w:val="auto"/>
+          <w:kern w:val="0"/>
+          <w:sz w:val="26"/>
+          <w:szCs w:val="26"/>
+          <w:lang w:val="es-ES" w:eastAsia="en-US" w:bidi="ar-SA"/>
+        </w:rPr>
+        <w:tab/>
+        <w:t>- Prueba 2: en archivo JS externo, se indica el archivo de JS dentro del head.</w:t>
+      </w:r>
+    </w:p>
+    <w:p>
+      <w:pPr>
+        <w:pStyle w:val="Cuerpodetexto"/>
+        <w:rPr>
+          <w:sz w:val="32"/>
+        </w:rPr>
+      </w:pPr>
+      <w:r>
+        <w:rPr>
+          <w:rFonts w:eastAsia="Times New Roman" w:cs="Times New Roman"/>
+          <w:b w:val="false"/>
+          <w:bCs w:val="false"/>
+          <w:color w:val="auto"/>
+          <w:kern w:val="0"/>
+          <w:sz w:val="26"/>
+          <w:szCs w:val="26"/>
+          <w:lang w:val="es-ES" w:eastAsia="en-US" w:bidi="ar-SA"/>
+        </w:rPr>
+        <w:drawing>
+          <wp:anchor behindDoc="0" distT="0" distB="0" distL="0" distR="0" simplePos="0" locked="0" layoutInCell="0" allowOverlap="1" relativeHeight="55">
+            <wp:simplePos x="0" y="0"/>
+            <wp:positionH relativeFrom="column">
+              <wp:align>center</wp:align>
+            </wp:positionH>
+            <wp:positionV relativeFrom="paragraph">
+              <wp:posOffset>635</wp:posOffset>
+            </wp:positionV>
+            <wp:extent cx="6874510" cy="2087880"/>
+            <wp:effectExtent l="0" t="0" r="0" b="0"/>
+            <wp:wrapTopAndBottom/>
+            <wp:docPr id="39" name="Imagen13" descr=""/>
+            <wp:cNvGraphicFramePr>
+              <a:graphicFrameLocks xmlns:a="http://schemas.openxmlformats.org/drawingml/2006/main" noChangeAspect="1"/>
+            </wp:cNvGraphicFramePr>
+            <a:graphic xmlns:a="http://schemas.openxmlformats.org/drawingml/2006/main">
+              <a:graphicData uri="http://schemas.openxmlformats.org/drawingml/2006/picture">
+                <pic:pic xmlns:pic="http://schemas.openxmlformats.org/drawingml/2006/picture">
+                  <pic:nvPicPr>
+                    <pic:cNvPr id="39" name="Imagen13" descr=""/>
+                    <pic:cNvPicPr>
+                      <a:picLocks noChangeAspect="1" noChangeArrowheads="1"/>
+                    </pic:cNvPicPr>
+                  </pic:nvPicPr>
+                  <pic:blipFill>
+                    <a:blip r:embed="rId35"/>
+                    <a:stretch>
+                      <a:fillRect/>
+                    </a:stretch>
+                  </pic:blipFill>
+                  <pic:spPr bwMode="auto">
+                    <a:xfrm>
+                      <a:off x="0" y="0"/>
+                      <a:ext cx="6874510" cy="2087880"/>
+                    </a:xfrm>
+                    <a:prstGeom prst="rect">
+                      <a:avLst/>
+                    </a:prstGeom>
+                  </pic:spPr>
+                </pic:pic>
+              </a:graphicData>
+            </a:graphic>
+          </wp:anchor>
+        </w:drawing>
+      </w:r>
+      <w:r>
+        <w:rPr>
+          <w:rFonts w:eastAsia="Times New Roman" w:cs="Times New Roman"/>
+          <w:b w:val="false"/>
+          <w:bCs w:val="false"/>
+          <w:color w:val="auto"/>
+          <w:kern w:val="0"/>
+          <w:sz w:val="26"/>
+          <w:szCs w:val="26"/>
+          <w:lang w:val="es-ES" w:eastAsia="en-US" w:bidi="ar-SA"/>
+        </w:rPr>
+        <w:tab/>
+        <w:tab/>
+      </w:r>
+    </w:p>
+    <w:p>
+      <w:pPr>
+        <w:pStyle w:val="Cuerpodetexto"/>
+        <w:rPr>
+          <w:sz w:val="32"/>
+        </w:rPr>
+      </w:pPr>
+      <w:r>
+        <w:rPr>
+          <w:b w:val="false"/>
+          <w:bCs w:val="false"/>
+          <w:sz w:val="26"/>
+          <w:szCs w:val="26"/>
+        </w:rPr>
+        <w:tab/>
+        <w:t>- Prueba 3: en etiqueta HTML: he creado un bot</w:t>
+      </w:r>
+      <w:r>
+        <w:rPr>
+          <w:rFonts w:eastAsia="Times New Roman" w:cs="Times New Roman"/>
+          <w:b w:val="false"/>
+          <w:bCs w:val="false"/>
+          <w:color w:val="auto"/>
+          <w:kern w:val="0"/>
+          <w:sz w:val="26"/>
+          <w:szCs w:val="26"/>
+          <w:lang w:val="es-ES" w:eastAsia="en-US" w:bidi="ar-SA"/>
+        </w:rPr>
+        <w:t xml:space="preserve">ón al final de mi código y con un evento onclick </w:t>
+        <w:tab/>
+        <w:t>le indico la función de mostrar mensaje.</w:t>
+      </w:r>
+    </w:p>
+    <w:p>
+      <w:pPr>
+        <w:pStyle w:val="Cuerpodetexto"/>
+        <w:rPr>
+          <w:sz w:val="32"/>
+        </w:rPr>
+      </w:pPr>
+      <w:r>
+        <w:rPr>
+          <w:sz w:val="32"/>
+        </w:rPr>
+        <w:drawing>
+          <wp:anchor behindDoc="0" distT="0" distB="0" distL="0" distR="0" simplePos="0" locked="0" layoutInCell="0" allowOverlap="1" relativeHeight="56">
+            <wp:simplePos x="0" y="0"/>
+            <wp:positionH relativeFrom="column">
+              <wp:align>center</wp:align>
+            </wp:positionH>
+            <wp:positionV relativeFrom="paragraph">
+              <wp:posOffset>635</wp:posOffset>
+            </wp:positionV>
+            <wp:extent cx="6874510" cy="1737995"/>
+            <wp:effectExtent l="0" t="0" r="0" b="0"/>
+            <wp:wrapTopAndBottom/>
+            <wp:docPr id="40" name="Imagen15" descr=""/>
+            <wp:cNvGraphicFramePr>
+              <a:graphicFrameLocks xmlns:a="http://schemas.openxmlformats.org/drawingml/2006/main" noChangeAspect="1"/>
+            </wp:cNvGraphicFramePr>
+            <a:graphic xmlns:a="http://schemas.openxmlformats.org/drawingml/2006/main">
+              <a:graphicData uri="http://schemas.openxmlformats.org/drawingml/2006/picture">
+                <pic:pic xmlns:pic="http://schemas.openxmlformats.org/drawingml/2006/picture">
+                  <pic:nvPicPr>
+                    <pic:cNvPr id="40" name="Imagen15" descr=""/>
+                    <pic:cNvPicPr>
+                      <a:picLocks noChangeAspect="1" noChangeArrowheads="1"/>
+                    </pic:cNvPicPr>
+                  </pic:nvPicPr>
+                  <pic:blipFill>
+                    <a:blip r:embed="rId36"/>
+                    <a:stretch>
+                      <a:fillRect/>
+                    </a:stretch>
+                  </pic:blipFill>
+                  <pic:spPr bwMode="auto">
+                    <a:xfrm>
+                      <a:off x="0" y="0"/>
+                      <a:ext cx="6874510" cy="1737995"/>
+                    </a:xfrm>
+                    <a:prstGeom prst="rect">
+                      <a:avLst/>
+                    </a:prstGeom>
+                  </pic:spPr>
+                </pic:pic>
+              </a:graphicData>
+            </a:graphic>
+          </wp:anchor>
+        </w:drawing>
+      </w:r>
+    </w:p>
+    <w:p>
+      <w:pPr>
+        <w:pStyle w:val="Cuerpodetexto"/>
+        <w:rPr>
+          <w:sz w:val="32"/>
+        </w:rPr>
+      </w:pPr>
+      <w:r>
+        <w:rPr>
+          <w:sz w:val="32"/>
+        </w:rPr>
+      </w:r>
+      <w:r>
+        <w:br w:type="page"/>
       </w:r>
     </w:p>
     <w:p>
@@ -7220,7 +8096,7 @@
           <w:sz w:val="30"/>
         </w:rPr>
       </w:pPr>
-      <w:hyperlink r:id="rId31">
+      <w:hyperlink r:id="rId37">
         <w:r>
           <w:rPr>
             <w:color w:val="5882AF"/>
@@ -7260,7 +8136,7 @@
       <w:r>
         <w:rPr/>
         <w:drawing>
-          <wp:anchor behindDoc="0" distT="0" distB="0" distL="0" distR="0" simplePos="0" locked="0" layoutInCell="0" allowOverlap="1" relativeHeight="28">
+          <wp:anchor behindDoc="0" distT="0" distB="0" distL="0" distR="0" simplePos="0" locked="0" layoutInCell="0" allowOverlap="1" relativeHeight="42">
             <wp:simplePos x="0" y="0"/>
             <wp:positionH relativeFrom="page">
               <wp:posOffset>685800</wp:posOffset>
@@ -7271,7 +8147,7 @@
             <wp:extent cx="6132830" cy="2194560"/>
             <wp:effectExtent l="0" t="0" r="0" b="0"/>
             <wp:wrapTopAndBottom/>
-            <wp:docPr id="30" name="image16.jpeg" descr=""/>
+            <wp:docPr id="41" name="image16.jpeg" descr=""/>
             <wp:cNvGraphicFramePr>
               <a:graphicFrameLocks xmlns:a="http://schemas.openxmlformats.org/drawingml/2006/main" noChangeAspect="1"/>
             </wp:cNvGraphicFramePr>
@@ -7279,13 +8155,13 @@
               <a:graphicData uri="http://schemas.openxmlformats.org/drawingml/2006/picture">
                 <pic:pic xmlns:pic="http://schemas.openxmlformats.org/drawingml/2006/picture">
                   <pic:nvPicPr>
-                    <pic:cNvPr id="30" name="image16.jpeg" descr=""/>
+                    <pic:cNvPr id="41" name="image16.jpeg" descr=""/>
                     <pic:cNvPicPr>
                       <a:picLocks noChangeAspect="1" noChangeArrowheads="1"/>
                     </pic:cNvPicPr>
                   </pic:nvPicPr>
                   <pic:blipFill>
-                    <a:blip r:embed="rId32"/>
+                    <a:blip r:embed="rId38"/>
                     <a:stretch>
                       <a:fillRect/>
                     </a:stretch>
@@ -7307,7 +8183,7 @@
       </w:r>
     </w:p>
     <w:sectPr>
-      <w:headerReference w:type="default" r:id="rId33"/>
+      <w:headerReference w:type="default" r:id="rId39"/>
       <w:type w:val="nextPage"/>
       <w:pgSz w:w="11906" w:h="16838"/>
       <w:pgMar w:left="380" w:right="700" w:gutter="0" w:header="703" w:top="1340" w:footer="0" w:bottom="280"/>
@@ -7325,7 +8201,7 @@
   <w:p>
     <w:pPr>
       <w:pStyle w:val="Cuerpodetexto"/>
-      <w:spacing w:lineRule="auto" w:line="12"/>
+      <w:spacing w:lineRule="auto" w:line="9"/>
       <w:rPr>
         <w:b w:val="false"/>
         <w:b w:val="false"/>
@@ -7337,12 +8213,10 @@
         <w:b w:val="false"/>
         <w:sz w:val="20"/>
       </w:rPr>
-    </w:r>
-    <w:r>
       <mc:AlternateContent>
         <mc:Choice Requires="wps">
           <w:drawing>
-            <wp:anchor behindDoc="1" distT="0" distB="0" distL="114300" distR="114300" simplePos="0" locked="0" layoutInCell="0" allowOverlap="1" relativeHeight="5">
+            <wp:anchor behindDoc="1" distT="0" distB="0" distL="0" distR="0" simplePos="0" locked="0" layoutInCell="0" allowOverlap="1" relativeHeight="8">
               <wp:simplePos x="0" y="0"/>
               <wp:positionH relativeFrom="page">
                 <wp:posOffset>3135630</wp:posOffset>
@@ -7353,23 +8227,30 @@
               <wp:extent cx="1583690" cy="194310"/>
               <wp:effectExtent l="0" t="0" r="0" b="0"/>
               <wp:wrapNone/>
-              <wp:docPr id="15" name="Marco2"/>
+              <wp:docPr id="16" name="Marco2"/>
               <a:graphic xmlns:a="http://schemas.openxmlformats.org/drawingml/2006/main">
                 <a:graphicData uri="http://schemas.microsoft.com/office/word/2010/wordprocessingShape">
                   <wps:wsp>
-                    <wps:cNvSpPr txBox="1"/>
+                    <wps:cNvSpPr/>
                     <wps:spPr>
                       <a:xfrm>
                         <a:off x="0" y="0"/>
-                        <a:ext cx="1583690" cy="194310"/>
+                        <a:ext cx="1583640" cy="194400"/>
                       </a:xfrm>
-                      <a:prstGeom prst="rect"/>
-                      <a:solidFill>
-                        <a:srgbClr val="FFFFFF">
-                          <a:alpha val="0"/>
-                        </a:srgbClr>
-                      </a:solidFill>
+                      <a:prstGeom prst="rect">
+                        <a:avLst/>
+                      </a:prstGeom>
+                      <a:noFill/>
+                      <a:ln w="0">
+                        <a:noFill/>
+                      </a:ln>
                     </wps:spPr>
+                    <wps:style>
+                      <a:lnRef idx="0"/>
+                      <a:fillRef idx="0"/>
+                      <a:effectRef idx="0"/>
+                      <a:fontRef idx="minor"/>
+                    </wps:style>
                     <wps:txbx>
                       <w:txbxContent>
                         <w:p>
@@ -7471,7 +8352,7 @@
                         </w:p>
                       </w:txbxContent>
                     </wps:txbx>
-                    <wps:bodyPr anchor="t" lIns="0" tIns="0" rIns="0" bIns="0">
+                    <wps:bodyPr lIns="0" rIns="0" tIns="0" bIns="0" anchor="t">
                       <a:noAutofit/>
                     </wps:bodyPr>
                   </wps:wsp>
@@ -7482,8 +8363,10 @@
         </mc:Choice>
         <mc:Fallback>
           <w:pict>
-            <v:rect stroked="f" strokeweight="0pt" style="position:absolute;rotation:-0;width:124.7pt;height:15.3pt;mso-wrap-distance-left:9pt;mso-wrap-distance-right:9pt;mso-wrap-distance-top:0pt;mso-wrap-distance-bottom:0pt;margin-top:34.15pt;mso-position-vertical-relative:page;margin-left:246.9pt;mso-position-horizontal-relative:page">
-              <v:textbox inset="0in,0in,0in,0in">
+            <v:rect id="shape_0" ID="Marco2" path="m0,0l-2147483645,0l-2147483645,-2147483646l0,-2147483646xe" fillcolor="white" stroked="f" o:allowincell="f" style="position:absolute;margin-left:246.9pt;margin-top:34.15pt;width:124.65pt;height:15.25pt;mso-wrap-style:square;v-text-anchor:top;mso-position-horizontal-relative:page;mso-position-vertical-relative:page">
+              <v:fill o:detectmouseclick="t" type="solid" color2="black" opacity="0"/>
+              <v:stroke color="#3465a4" joinstyle="round" endcap="flat"/>
+              <v:textbox>
                 <w:txbxContent>
                   <w:p>
                     <w:pPr>
@@ -7599,7 +8482,7 @@
   <w:p>
     <w:pPr>
       <w:pStyle w:val="Cuerpodetexto"/>
-      <w:spacing w:lineRule="auto" w:line="12"/>
+      <w:spacing w:lineRule="auto" w:line="9"/>
       <w:rPr>
         <w:b w:val="false"/>
         <w:b w:val="false"/>
@@ -7611,12 +8494,10 @@
         <w:b w:val="false"/>
         <w:sz w:val="20"/>
       </w:rPr>
-    </w:r>
-    <w:r>
       <mc:AlternateContent>
         <mc:Choice Requires="wps">
           <w:drawing>
-            <wp:anchor behindDoc="1" distT="0" distB="0" distL="114300" distR="114300" simplePos="0" locked="0" layoutInCell="0" allowOverlap="1" relativeHeight="8">
+            <wp:anchor behindDoc="1" distT="0" distB="0" distL="0" distR="0" simplePos="0" locked="0" layoutInCell="0" allowOverlap="1" relativeHeight="12">
               <wp:simplePos x="0" y="0"/>
               <wp:positionH relativeFrom="page">
                 <wp:posOffset>3135630</wp:posOffset>
@@ -7627,23 +8508,30 @@
               <wp:extent cx="1583690" cy="194310"/>
               <wp:effectExtent l="0" t="0" r="0" b="0"/>
               <wp:wrapNone/>
-              <wp:docPr id="23" name=""/>
+              <wp:docPr id="25" name="Forma3"/>
               <a:graphic xmlns:a="http://schemas.openxmlformats.org/drawingml/2006/main">
                 <a:graphicData uri="http://schemas.microsoft.com/office/word/2010/wordprocessingShape">
                   <wps:wsp>
-                    <wps:cNvSpPr txBox="1"/>
+                    <wps:cNvSpPr/>
                     <wps:spPr>
                       <a:xfrm>
                         <a:off x="0" y="0"/>
-                        <a:ext cx="1583690" cy="194310"/>
+                        <a:ext cx="1583640" cy="194400"/>
                       </a:xfrm>
-                      <a:prstGeom prst="rect"/>
-                      <a:solidFill>
-                        <a:srgbClr val="FFFFFF">
-                          <a:alpha val="0"/>
-                        </a:srgbClr>
-                      </a:solidFill>
+                      <a:prstGeom prst="rect">
+                        <a:avLst/>
+                      </a:prstGeom>
+                      <a:noFill/>
+                      <a:ln w="0">
+                        <a:noFill/>
+                      </a:ln>
                     </wps:spPr>
+                    <wps:style>
+                      <a:lnRef idx="0"/>
+                      <a:fillRef idx="0"/>
+                      <a:effectRef idx="0"/>
+                      <a:fontRef idx="minor"/>
+                    </wps:style>
                     <wps:txbx>
                       <w:txbxContent>
                         <w:p>
@@ -7745,7 +8633,7 @@
                         </w:p>
                       </w:txbxContent>
                     </wps:txbx>
-                    <wps:bodyPr anchor="t" lIns="0" tIns="0" rIns="0" bIns="0">
+                    <wps:bodyPr lIns="0" rIns="0" tIns="0" bIns="0" anchor="t">
                       <a:noAutofit/>
                     </wps:bodyPr>
                   </wps:wsp>
@@ -7756,8 +8644,10 @@
         </mc:Choice>
         <mc:Fallback>
           <w:pict>
-            <v:rect stroked="f" strokeweight="0pt" style="position:absolute;rotation:-0;width:124.7pt;height:15.3pt;mso-wrap-distance-left:9pt;mso-wrap-distance-right:9pt;mso-wrap-distance-top:0pt;mso-wrap-distance-bottom:0pt;margin-top:34.15pt;mso-position-vertical-relative:page;margin-left:246.9pt;mso-position-horizontal-relative:page">
-              <v:textbox inset="0in,0in,0in,0in">
+            <v:rect id="shape_0" ID="Forma3" path="m0,0l-2147483645,0l-2147483645,-2147483646l0,-2147483646xe" fillcolor="white" stroked="f" o:allowincell="f" style="position:absolute;margin-left:246.9pt;margin-top:34.15pt;width:124.65pt;height:15.25pt;mso-wrap-style:square;v-text-anchor:top;mso-position-horizontal-relative:page;mso-position-vertical-relative:page">
+              <v:fill o:detectmouseclick="t" type="solid" color2="black" opacity="0"/>
+              <v:stroke color="#3465a4" joinstyle="round" endcap="flat"/>
+              <v:textbox>
                 <w:txbxContent>
                   <w:p>
                     <w:pPr>
@@ -7873,7 +8763,7 @@
   <w:p>
     <w:pPr>
       <w:pStyle w:val="Cuerpodetexto"/>
-      <w:spacing w:lineRule="auto" w:line="12"/>
+      <w:spacing w:lineRule="auto" w:line="9"/>
       <w:rPr>
         <w:b w:val="false"/>
         <w:b w:val="false"/>
@@ -7885,12 +8775,10 @@
         <w:b w:val="false"/>
         <w:sz w:val="20"/>
       </w:rPr>
-    </w:r>
-    <w:r>
       <mc:AlternateContent>
         <mc:Choice Requires="wps">
           <w:drawing>
-            <wp:anchor behindDoc="1" distT="0" distB="0" distL="114300" distR="114300" simplePos="0" locked="0" layoutInCell="0" allowOverlap="1" relativeHeight="9">
+            <wp:anchor behindDoc="1" distT="0" distB="0" distL="0" distR="0" simplePos="0" locked="0" layoutInCell="0" allowOverlap="1" relativeHeight="16">
               <wp:simplePos x="0" y="0"/>
               <wp:positionH relativeFrom="page">
                 <wp:posOffset>3135630</wp:posOffset>
@@ -7901,23 +8789,30 @@
               <wp:extent cx="1583690" cy="194310"/>
               <wp:effectExtent l="0" t="0" r="0" b="0"/>
               <wp:wrapNone/>
-              <wp:docPr id="28" name=""/>
+              <wp:docPr id="36" name="Forma4"/>
               <a:graphic xmlns:a="http://schemas.openxmlformats.org/drawingml/2006/main">
                 <a:graphicData uri="http://schemas.microsoft.com/office/word/2010/wordprocessingShape">
                   <wps:wsp>
-                    <wps:cNvSpPr txBox="1"/>
+                    <wps:cNvSpPr/>
                     <wps:spPr>
                       <a:xfrm>
                         <a:off x="0" y="0"/>
-                        <a:ext cx="1583690" cy="194310"/>
+                        <a:ext cx="1583640" cy="194400"/>
                       </a:xfrm>
-                      <a:prstGeom prst="rect"/>
-                      <a:solidFill>
-                        <a:srgbClr val="FFFFFF">
-                          <a:alpha val="0"/>
-                        </a:srgbClr>
-                      </a:solidFill>
+                      <a:prstGeom prst="rect">
+                        <a:avLst/>
+                      </a:prstGeom>
+                      <a:noFill/>
+                      <a:ln w="0">
+                        <a:noFill/>
+                      </a:ln>
                     </wps:spPr>
+                    <wps:style>
+                      <a:lnRef idx="0"/>
+                      <a:fillRef idx="0"/>
+                      <a:effectRef idx="0"/>
+                      <a:fontRef idx="minor"/>
+                    </wps:style>
                     <wps:txbx>
                       <w:txbxContent>
                         <w:p>
@@ -8019,7 +8914,7 @@
                         </w:p>
                       </w:txbxContent>
                     </wps:txbx>
-                    <wps:bodyPr anchor="t" lIns="0" tIns="0" rIns="0" bIns="0">
+                    <wps:bodyPr lIns="0" rIns="0" tIns="0" bIns="0" anchor="t">
                       <a:noAutofit/>
                     </wps:bodyPr>
                   </wps:wsp>
@@ -8030,8 +8925,10 @@
         </mc:Choice>
         <mc:Fallback>
           <w:pict>
-            <v:rect stroked="f" strokeweight="0pt" style="position:absolute;rotation:-0;width:124.7pt;height:15.3pt;mso-wrap-distance-left:9pt;mso-wrap-distance-right:9pt;mso-wrap-distance-top:0pt;mso-wrap-distance-bottom:0pt;margin-top:34.15pt;mso-position-vertical-relative:page;margin-left:246.9pt;mso-position-horizontal-relative:page">
-              <v:textbox inset="0in,0in,0in,0in">
+            <v:rect id="shape_0" ID="Forma4" path="m0,0l-2147483645,0l-2147483645,-2147483646l0,-2147483646xe" fillcolor="white" stroked="f" o:allowincell="f" style="position:absolute;margin-left:246.9pt;margin-top:34.15pt;width:124.65pt;height:15.25pt;mso-wrap-style:square;v-text-anchor:top;mso-position-horizontal-relative:page;mso-position-vertical-relative:page">
+              <v:fill o:detectmouseclick="t" type="solid" color2="black" opacity="0"/>
+              <v:stroke color="#3465a4" joinstyle="round" endcap="flat"/>
+              <v:textbox>
                 <w:txbxContent>
                   <w:p>
                     <w:pPr>
@@ -8147,7 +9044,7 @@
   <w:p>
     <w:pPr>
       <w:pStyle w:val="Cuerpodetexto"/>
-      <w:spacing w:lineRule="auto" w:line="12"/>
+      <w:spacing w:lineRule="auto" w:line="9"/>
       <w:rPr>
         <w:b w:val="false"/>
         <w:b w:val="false"/>
@@ -8159,12 +9056,10 @@
         <w:b w:val="false"/>
         <w:sz w:val="20"/>
       </w:rPr>
-    </w:r>
-    <w:r>
       <mc:AlternateContent>
         <mc:Choice Requires="wps">
           <w:drawing>
-            <wp:anchor behindDoc="1" distT="0" distB="0" distL="114300" distR="114300" simplePos="0" locked="0" layoutInCell="0" allowOverlap="1" relativeHeight="10">
+            <wp:anchor behindDoc="1" distT="0" distB="0" distL="0" distR="0" simplePos="0" locked="0" layoutInCell="0" allowOverlap="1" relativeHeight="20">
               <wp:simplePos x="0" y="0"/>
               <wp:positionH relativeFrom="page">
                 <wp:posOffset>3135630</wp:posOffset>
@@ -8175,23 +9070,30 @@
               <wp:extent cx="1583690" cy="194310"/>
               <wp:effectExtent l="0" t="0" r="0" b="0"/>
               <wp:wrapNone/>
-              <wp:docPr id="31" name=""/>
+              <wp:docPr id="42" name="Forma6"/>
               <a:graphic xmlns:a="http://schemas.openxmlformats.org/drawingml/2006/main">
                 <a:graphicData uri="http://schemas.microsoft.com/office/word/2010/wordprocessingShape">
                   <wps:wsp>
-                    <wps:cNvSpPr txBox="1"/>
+                    <wps:cNvSpPr/>
                     <wps:spPr>
                       <a:xfrm>
                         <a:off x="0" y="0"/>
-                        <a:ext cx="1583690" cy="194310"/>
+                        <a:ext cx="1583640" cy="194400"/>
                       </a:xfrm>
-                      <a:prstGeom prst="rect"/>
-                      <a:solidFill>
-                        <a:srgbClr val="FFFFFF">
-                          <a:alpha val="0"/>
-                        </a:srgbClr>
-                      </a:solidFill>
+                      <a:prstGeom prst="rect">
+                        <a:avLst/>
+                      </a:prstGeom>
+                      <a:noFill/>
+                      <a:ln w="0">
+                        <a:noFill/>
+                      </a:ln>
                     </wps:spPr>
+                    <wps:style>
+                      <a:lnRef idx="0"/>
+                      <a:fillRef idx="0"/>
+                      <a:effectRef idx="0"/>
+                      <a:fontRef idx="minor"/>
+                    </wps:style>
                     <wps:txbx>
                       <w:txbxContent>
                         <w:p>
@@ -8293,7 +9195,7 @@
                         </w:p>
                       </w:txbxContent>
                     </wps:txbx>
-                    <wps:bodyPr anchor="t" lIns="0" tIns="0" rIns="0" bIns="0">
+                    <wps:bodyPr lIns="0" rIns="0" tIns="0" bIns="0" anchor="t">
                       <a:noAutofit/>
                     </wps:bodyPr>
                   </wps:wsp>
@@ -8304,8 +9206,10 @@
         </mc:Choice>
         <mc:Fallback>
           <w:pict>
-            <v:rect stroked="f" strokeweight="0pt" style="position:absolute;rotation:-0;width:124.7pt;height:15.3pt;mso-wrap-distance-left:9pt;mso-wrap-distance-right:9pt;mso-wrap-distance-top:0pt;mso-wrap-distance-bottom:0pt;margin-top:34.15pt;mso-position-vertical-relative:page;margin-left:246.9pt;mso-position-horizontal-relative:page">
-              <v:textbox inset="0in,0in,0in,0in">
+            <v:rect id="shape_0" ID="Forma6" path="m0,0l-2147483645,0l-2147483645,-2147483646l0,-2147483646xe" fillcolor="white" stroked="f" o:allowincell="f" style="position:absolute;margin-left:246.9pt;margin-top:34.15pt;width:124.65pt;height:15.25pt;mso-wrap-style:square;v-text-anchor:top;mso-position-horizontal-relative:page;mso-position-vertical-relative:page">
+              <v:fill o:detectmouseclick="t" type="solid" color2="black" opacity="0"/>
+              <v:stroke color="#3465a4" joinstyle="round" endcap="flat"/>
+              <v:textbox>
                 <w:txbxContent>
                   <w:p>
                     <w:pPr>
@@ -9014,6 +9918,7 @@
     <w:rsid w:val="00951306"/>
     <w:pPr>
       <w:widowControl w:val="false"/>
+      <w:suppressAutoHyphens w:val="true"/>
       <w:bidi w:val="0"/>
       <w:spacing w:before="0" w:after="0"/>
       <w:jc w:val="left"/>

</xml_diff>